<commit_message>
Fix superscript citations in Word output
Pandoc drops raw-HTML <sup> tags when writing docx, leaving citation
numbers as plain text. convert_to_vancouver.py now converts to pandoc's
native ^N^ syntax and builds MANUSCRIPT_IJSSC.docx itself; verified 49
true superscript runs in the document XML.

Co-Authored-By: Claude Fable 5 <noreply@anthropic.com>
</commit_message>
<xml_diff>
--- a/forskning/ncc-kohort/submission_pse/MANUSCRIPT_IJSSC.docx
+++ b/forskning/ncc-kohort/submission_pse/MANUSCRIPT_IJSSC.docx
@@ -96,6 +96,9 @@
         <w:t xml:space="preserve">Organized youth sport is widely promoted for its benefits for physical health, psychosocial development, and social connection</w:t>
       </w:r>
       <w:r>
+        <w:rPr>
+          <w:vertAlign w:val="superscript"/>
+        </w:rPr>
         <w:t xml:space="preserve">1</w:t>
       </w:r>
       <w:r>
@@ -105,6 +108,9 @@
         <w:t xml:space="preserve">— benefits that presuppose that young people stay involved. Attrition from organized competition during adolescence is substantial across countries and sports,</w:t>
       </w:r>
       <w:r>
+        <w:rPr>
+          <w:vertAlign w:val="superscript"/>
+        </w:rPr>
         <w:t xml:space="preserve">2</w:t>
       </w:r>
       <w:r>
@@ -114,6 +120,9 @@
         <w:t xml:space="preserve">and track and field is no exception: in a 25-year Norwegian follow-up, roughly 82% of promising track and field athletes identified in adolescence had left the sport within 14 years,</w:t>
       </w:r>
       <w:r>
+        <w:rPr>
+          <w:vertAlign w:val="superscript"/>
+        </w:rPr>
         <w:t xml:space="preserve">3</w:t>
       </w:r>
       <w:r>
@@ -131,6 +140,9 @@
         <w:t xml:space="preserve">Terminology in this literature is often ambiguous, so we fix ours at the outset. Following Battaglia et al.,</w:t>
       </w:r>
       <w:r>
+        <w:rPr>
+          <w:vertAlign w:val="superscript"/>
+        </w:rPr>
         <w:t xml:space="preserve">4</w:t>
       </w:r>
       <w:r>
@@ -203,6 +215,9 @@
         <w:t xml:space="preserve">rather than a discrete event,</w:t>
       </w:r>
       <w:r>
+        <w:rPr>
+          <w:vertAlign w:val="superscript"/>
+        </w:rPr>
         <w:t xml:space="preserve">5</w:t>
       </w:r>
       <w:r>
@@ -212,6 +227,9 @@
         <w:t xml:space="preserve">so some form of decline over a period of time should be expected. The Sport Commitment Model</w:t>
       </w:r>
       <w:r>
+        <w:rPr>
+          <w:vertAlign w:val="superscript"/>
+        </w:rPr>
         <w:t xml:space="preserve">6,7</w:t>
       </w:r>
       <w:r>
@@ -221,6 +239,9 @@
         <w:t xml:space="preserve">describes how the desire and resolve to continue are shaped by enjoyment, personal investments, involvement opportunities, attractive alternatives, and social constraints; Kretchmar’s</w:t>
       </w:r>
       <w:r>
+        <w:rPr>
+          <w:vertAlign w:val="superscript"/>
+        </w:rPr>
         <w:t xml:space="preserve">8</w:t>
       </w:r>
       <w:r>
@@ -238,6 +259,9 @@
         <w:t xml:space="preserve">The most developed account of this process view comes from sociology. Eliasson and Johansson</w:t>
       </w:r>
       <w:r>
+        <w:rPr>
+          <w:vertAlign w:val="superscript"/>
+        </w:rPr>
         <w:t xml:space="preserve">5</w:t>
       </w:r>
       <w:r>
@@ -247,6 +271,9 @@
         <w:t xml:space="preserve">applied Ebaugh’s</w:t>
       </w:r>
       <w:r>
+        <w:rPr>
+          <w:vertAlign w:val="superscript"/>
+        </w:rPr>
         <w:t xml:space="preserve">9</w:t>
       </w:r>
       <w:r>
@@ -256,6 +283,9 @@
         <w:t xml:space="preserve">role-exit framework — in which leaving a social role proceeds through stages of first doubts, seeking and weighing alternatives, a turning point, and the construction of an ex-role identity — to youth sport, interviewing adolescent girls and their parents. Withdrawal resulted from interacting changes in the sport organization, the athletes’ broader lives, and the expectations attached to the young-athlete role; the process could be long, emotionally demanding, and decreasingly reversible. Survey evidence from Norwegian youth complements this picture: stated reasons for leaving organized sport are diverse and patterned by social background, with cost-related reasons cited more often by youth from lower-income families.</w:t>
       </w:r>
       <w:r>
+        <w:rPr>
+          <w:vertAlign w:val="superscript"/>
+        </w:rPr>
         <w:t xml:space="preserve">10</w:t>
       </w:r>
     </w:p>
@@ -267,6 +297,9 @@
         <w:t xml:space="preserve">Groups of athletes also appear to differ in how they respond when competitive demands increase. Norwegian participation research documents strong stratification of ambition and investment among youth participants — a minority train and compete with long-term aspirations, while a larger group take part for enjoyment and belonging and more readily reprioritize when sport becomes demanding</w:t>
       </w:r>
       <w:r>
+        <w:rPr>
+          <w:vertAlign w:val="superscript"/>
+        </w:rPr>
         <w:t xml:space="preserve">11</w:t>
       </w:r>
       <w:r>
@@ -276,6 +309,9 @@
         <w:t xml:space="preserve">— and the Sport Commitment Model’s distinction between enthusiastic and constrained commitment predicts exactly such divergent responses to rising demands.</w:t>
       </w:r>
       <w:r>
+        <w:rPr>
+          <w:vertAlign w:val="superscript"/>
+        </w:rPr>
         <w:t xml:space="preserve">7</w:t>
       </w:r>
       <w:r>
@@ -285,6 +321,9 @@
         <w:t xml:space="preserve">Consistent with the idea that such differences leave behavioral traces well before exit, retrospective comparisons of developmental activities show that youth ice-hockey players who later dropped out already differed from persisting peers in their earlier training patterns — for example, taking up intense sport-specific off-ice training at younger ages.</w:t>
       </w:r>
       <w:r>
+        <w:rPr>
+          <w:vertAlign w:val="superscript"/>
+        </w:rPr>
         <w:t xml:space="preserve">12</w:t>
       </w:r>
       <w:r>
@@ -312,6 +351,9 @@
         <w:t xml:space="preserve">These theories indicate what might happen over time as participants continue or withdraw from their sport(s), but none provides direct longitudinal behavioral evidence. Withdrawn athletes are systematically harder to recruit into surveys,</w:t>
       </w:r>
       <w:r>
+        <w:rPr>
+          <w:vertAlign w:val="superscript"/>
+        </w:rPr>
         <w:t xml:space="preserve">1</w:t>
       </w:r>
       <w:r>
@@ -321,6 +363,9 @@
         <w:t xml:space="preserve">and the hypothesized timescale (1–3 years) exceeds most prospective follow-up windows — Sarrazin et al.’s</w:t>
       </w:r>
       <w:r>
+        <w:rPr>
+          <w:vertAlign w:val="superscript"/>
+        </w:rPr>
         <w:t xml:space="preserve">13</w:t>
       </w:r>
       <w:r>
@@ -330,6 +375,9 @@
         <w:t xml:space="preserve">21-month handball study is unusually long and still does not bridge the adolescent-to-junior transition. A separate quantitative tradition studies correlates of dropout and development — relative age effects,</w:t>
       </w:r>
       <w:r>
+        <w:rPr>
+          <w:vertAlign w:val="superscript"/>
+        </w:rPr>
         <w:t xml:space="preserve">14</w:t>
       </w:r>
       <w:r>
@@ -339,6 +387,9 @@
         <w:t xml:space="preserve">specialization</w:t>
       </w:r>
       <w:r>
+        <w:rPr>
+          <w:vertAlign w:val="superscript"/>
+        </w:rPr>
         <w:t xml:space="preserve">15–18</w:t>
       </w:r>
       <w:r>
@@ -348,12 +399,18 @@
         <w:t xml:space="preserve">— and short longitudinal designs measuring proximal psychological constructs</w:t>
       </w:r>
       <w:r>
+        <w:rPr>
+          <w:vertAlign w:val="superscript"/>
+        </w:rPr>
         <w:t xml:space="preserve">19–21</w:t>
       </w:r>
       <w:r>
         <w:t xml:space="preserve">; prospective psychosocial predictors of adolescent dropout have been meta-analyzed,</w:t>
       </w:r>
       <w:r>
+        <w:rPr>
+          <w:vertAlign w:val="superscript"/>
+        </w:rPr>
         <w:t xml:space="preserve">22</w:t>
       </w:r>
       <w:r>
@@ -379,6 +436,9 @@
         <w:t xml:space="preserve">trajectories across the youth-to-senior transition.</w:t>
       </w:r>
       <w:r>
+        <w:rPr>
+          <w:vertAlign w:val="superscript"/>
+        </w:rPr>
         <w:t xml:space="preserve">23</w:t>
       </w:r>
       <w:r>
@@ -422,6 +482,9 @@
         <w:t xml:space="preserve">Track and field suits such a test: participation choices are visible event by event, entries are individually chosen rather than coach-selected (Section 2.2), performances are objectively measured, and a single national register captures every sanctioned result. We studied 2,123 Norwegian youth athletes longitudinally for up to 14 years using the federation’s competition register (see Figure 1) and tested three hypotheses. First, because withdrawal is described as a protracted, deliberative process</w:t>
       </w:r>
       <w:r>
+        <w:rPr>
+          <w:vertAlign w:val="superscript"/>
+        </w:rPr>
         <w:t xml:space="preserve">5,9</w:t>
       </w:r>
       <w:r>
@@ -431,6 +494,9 @@
         <w:t xml:space="preserve">and because more and less committed participants are expected to respond differently to rising competitive demands,</w:t>
       </w:r>
       <w:r>
+        <w:rPr>
+          <w:vertAlign w:val="superscript"/>
+        </w:rPr>
         <w:t xml:space="preserve">7,11</w:t>
       </w:r>
       <w:r>
@@ -456,6 +522,9 @@
         <w:t xml:space="preserve">of future retainers and future dropouts would diverge before the final registered season — in two separable forms that we test separately: early between-athlete differences in level, and within-athlete decline. Second, because the determinants of sport commitment are experiential and volitional — enjoyment, investment, alternatives, constraint — rather than ability-based,</w:t>
       </w:r>
       <w:r>
+        <w:rPr>
+          <w:vertAlign w:val="superscript"/>
+        </w:rPr>
         <w:t xml:space="preserve">6,7</w:t>
       </w:r>
       <w:r>
@@ -564,6 +633,9 @@
         <w:t xml:space="preserve">This retrospective longitudinal cohort study uses the national competition register as its only data source; the cohort is the entire population satisfying the inclusion criterion, so estimates describe that population. We follow the Strengthening the Reporting of Observational Studies in Epidemiology (STROBE) guideline where relevant.</w:t>
       </w:r>
       <w:r>
+        <w:rPr>
+          <w:vertAlign w:val="superscript"/>
+        </w:rPr>
         <w:t xml:space="preserve">24</w:t>
       </w:r>
     </w:p>
@@ -585,6 +657,9 @@
         <w:t xml:space="preserve">Norwegian youth track and field is organized as a low-threshold, open-entry system. Up to age 15, essentially all meets are open to all club-registered athletes: there are no qualifying standards, no roster selection, and no coach-controlled gatekeeping.</w:t>
       </w:r>
       <w:r>
+        <w:rPr>
+          <w:vertAlign w:val="superscript"/>
+        </w:rPr>
         <w:t xml:space="preserve">25</w:t>
       </w:r>
       <w:r>
@@ -665,6 +740,9 @@
         <w:t xml:space="preserve">Each result was scored in Tyrving points, the Norwegian federation’s age-norm system</w:t>
       </w:r>
       <w:r>
+        <w:rPr>
+          <w:vertAlign w:val="superscript"/>
+        </w:rPr>
         <w:t xml:space="preserve">26</w:t>
       </w:r>
       <w:r>
@@ -910,6 +988,9 @@
         <w:t xml:space="preserve">Time from baseline to last active season was modeled with Cox proportional hazards regression,</w:t>
       </w:r>
       <w:r>
+        <w:rPr>
+          <w:vertAlign w:val="superscript"/>
+        </w:rPr>
         <w:t xml:space="preserve">27</w:t>
       </w:r>
       <w:r>
@@ -919,6 +1000,9 @@
         <w:t xml:space="preserve">with a baseline-only primary specification (Supplementary Table S16), a landmark analysis among athletes active at age 16,</w:t>
       </w:r>
       <w:r>
+        <w:rPr>
+          <w:vertAlign w:val="superscript"/>
+        </w:rPr>
         <w:t xml:space="preserve">28</w:t>
       </w:r>
       <w:r>
@@ -928,6 +1012,9 @@
         <w:t xml:space="preserve">and a post-baseline specification interpreted with overlap caveats (Supplementary Table S8; Table 5). Proportional-hazards checks, E-values,</w:t>
       </w:r>
       <w:r>
+        <w:rPr>
+          <w:vertAlign w:val="superscript"/>
+        </w:rPr>
         <w:t xml:space="preserve">29</w:t>
       </w:r>
       <w:r>
@@ -955,6 +1042,9 @@
         <w:t xml:space="preserve">Because the design observes the full eligible population, classical a-priori power analysis does not apply; a detection-capacity analysis (Supplementary Methods) shows the design could detect hazard ratios ≥1.07 and odds ratios ≥1.20 per SD — well below effect sizes typical of prior dropout research.</w:t>
       </w:r>
       <w:r>
+        <w:rPr>
+          <w:vertAlign w:val="superscript"/>
+        </w:rPr>
         <w:t xml:space="preserve">22</w:t>
       </w:r>
       <w:r>
@@ -982,6 +1072,9 @@
         <w:t xml:space="preserve">Analyses used Python 3.13 with lifelines</w:t>
       </w:r>
       <w:r>
+        <w:rPr>
+          <w:vertAlign w:val="superscript"/>
+        </w:rPr>
         <w:t xml:space="preserve">30</w:t>
       </w:r>
       <w:r>
@@ -991,12 +1084,18 @@
         <w:t xml:space="preserve">and scikit-learn</w:t>
       </w:r>
       <w:r>
+        <w:rPr>
+          <w:vertAlign w:val="superscript"/>
+        </w:rPr>
         <w:t xml:space="preserve">31</w:t>
       </w:r>
       <w:r>
         <w:t xml:space="preserve">; figures used matplotlib.</w:t>
       </w:r>
       <w:r>
+        <w:rPr>
+          <w:vertAlign w:val="superscript"/>
+        </w:rPr>
         <w:t xml:space="preserve">32</w:t>
       </w:r>
       <w:r>
@@ -1025,6 +1124,9 @@
         <w:t xml:space="preserve">Following SAGER guidance,</w:t>
       </w:r>
       <w:r>
+        <w:rPr>
+          <w:vertAlign w:val="superscript"/>
+        </w:rPr>
         <w:t xml:space="preserve">33</w:t>
       </w:r>
       <w:r>
@@ -1851,6 +1953,9 @@
         <w:t xml:space="preserve">cost-related reasons for leaving are cited more often by Norwegian youth from lower-income families</w:t>
       </w:r>
       <w:r>
+        <w:rPr>
+          <w:vertAlign w:val="superscript"/>
+        </w:rPr>
         <w:t xml:space="preserve">10</w:t>
       </w:r>
       <w:r>
@@ -1873,6 +1978,9 @@
         <w:t xml:space="preserve">injuries were the most frequent dropout reason in the only long-term Norwegian track-and-field follow-up (24.3%)</w:t>
       </w:r>
       <w:r>
+        <w:rPr>
+          <w:vertAlign w:val="superscript"/>
+        </w:rPr>
         <w:t xml:space="preserve">3</w:t>
       </w:r>
       <w:r>
@@ -1913,6 +2021,9 @@
         <w:t xml:space="preserve">Is the divergence in Figure 2 genuine within-athlete pull-back, or early differentiation only — or an artifact of averaging abrupt exits at heterogeneous ages? The exit-aligned analyses answer at the individual level: 95% of dropouts were still competing in their penultimate season, 74% had a reduced-but-nonzero penultimate season, and only 19% exited directly from peak volume — a two-to-three-season taper, not a cliff. Both components are nonetheless real: level and change carried independent information (Table 4), the pattern held in the contamination-free window (level OR = 3.04; change OR = 1.88), and future dropouts already differed at 13–14 — consistent with retrospective evidence that dropouts’ developmental activities differ years before exit.</w:t>
       </w:r>
       <w:r>
+        <w:rPr>
+          <w:vertAlign w:val="superscript"/>
+        </w:rPr>
         <w:t xml:space="preserve">12</w:t>
       </w:r>
     </w:p>
@@ -1934,6 +2045,9 @@
         <w:t xml:space="preserve">We assess behavior, not motivational processes, so no single framework is confirmed; but the footprint is consistent with the main process accounts. In the Sport Commitment Model,</w:t>
       </w:r>
       <w:r>
+        <w:rPr>
+          <w:vertAlign w:val="superscript"/>
+        </w:rPr>
         <w:t xml:space="preserve">6,7</w:t>
       </w:r>
       <w:r>
@@ -1975,6 +2089,9 @@
         <w:t xml:space="preserve">commitment — the latter less sustainable and linked to burnout.</w:t>
       </w:r>
       <w:r>
+        <w:rPr>
+          <w:vertAlign w:val="superscript"/>
+        </w:rPr>
         <w:t xml:space="preserve">34</w:t>
       </w:r>
       <w:r>
@@ -1984,6 +2101,9 @@
         <w:t xml:space="preserve">Declining volume years before exit fits an eroding commitment balance, though the register cannot distinguish waning enthusiasm from accumulating constraint. Withdrawal-as-process accounts</w:t>
       </w:r>
       <w:r>
+        <w:rPr>
+          <w:vertAlign w:val="superscript"/>
+        </w:rPr>
         <w:t xml:space="preserve">5,9</w:t>
       </w:r>
       <w:r>
@@ -2030,6 +2150,9 @@
         <w:t xml:space="preserve">: ages 14–16 are precisely when Norwegian multi-sport youth consolidate into one sport, so for some athletes declining track-and-field volume signals rising commitment to handball or football rather than to nothing. The register cannot separate the two, and the reallocation share is unbounded in our data. Norwegian participation research is compatible with both: ambition is strongly stratified among youth participants,</w:t>
       </w:r>
       <w:r>
+        <w:rPr>
+          <w:vertAlign w:val="superscript"/>
+        </w:rPr>
         <w:t xml:space="preserve">11</w:t>
       </w:r>
       <w:r>
@@ -2039,6 +2162,9 @@
         <w:t xml:space="preserve">and exit from organized sport can itself reclaim time and autonomy rather than mark a loss.</w:t>
       </w:r>
       <w:r>
+        <w:rPr>
+          <w:vertAlign w:val="superscript"/>
+        </w:rPr>
         <w:t xml:space="preserve">35</w:t>
       </w:r>
       <w:r>
@@ -2137,6 +2263,9 @@
         <w:t xml:space="preserve">, the behavioral pathway. This complements survey reports of higher female dropout</w:t>
       </w:r>
       <w:r>
+        <w:rPr>
+          <w:vertAlign w:val="superscript"/>
+        </w:rPr>
         <w:t xml:space="preserve">11</w:t>
       </w:r>
       <w:r>
@@ -2146,6 +2275,9 @@
         <w:t xml:space="preserve">and the clearly higher female attrition in Enoksen’s</w:t>
       </w:r>
       <w:r>
+        <w:rPr>
+          <w:vertAlign w:val="superscript"/>
+        </w:rPr>
         <w:t xml:space="preserve">3</w:t>
       </w:r>
       <w:r>
@@ -2205,6 +2337,9 @@
         <w:t xml:space="preserve">— multisport sampling versus early single-sport specialization and its consequences for elite performance and athlete health.</w:t>
       </w:r>
       <w:r>
+        <w:rPr>
+          <w:vertAlign w:val="superscript"/>
+        </w:rPr>
         <w:t xml:space="preserve">17,18</w:t>
       </w:r>
       <w:r>
@@ -2246,6 +2381,9 @@
         <w:t xml:space="preserve">positively related to burnout and dropout,</w:t>
       </w:r>
       <w:r>
+        <w:rPr>
+          <w:vertAlign w:val="superscript"/>
+        </w:rPr>
         <w:t xml:space="preserve">36</w:t>
       </w:r>
       <w:r>
@@ -2255,6 +2393,9 @@
         <w:t xml:space="preserve">and blanket condemnation of early specialization has been argued to outrun the evidence</w:t>
       </w:r>
       <w:r>
+        <w:rPr>
+          <w:vertAlign w:val="superscript"/>
+        </w:rPr>
         <w:t xml:space="preserve">37</w:t>
       </w:r>
       <w:r>
@@ -2415,6 +2556,9 @@
         <w:t xml:space="preserve">With entry fees club-paid and travel short (Section 2.2), the remaining levers are residual and psychological costs: membership and equipment support, coach-accompanied transport, low-stakes practice meets, and an explicit signal that participation is welcome regardless of performance — each acting on the cost side of the engagement balance.</w:t>
       </w:r>
       <w:r>
+        <w:rPr>
+          <w:vertAlign w:val="superscript"/>
+        </w:rPr>
         <w:t xml:space="preserve">6,7</w:t>
       </w:r>
       <w:r>
@@ -2539,6 +2683,9 @@
         <w:t xml:space="preserve">, not from sport: a sport-switcher counts as a dropout, and the reallocation share is unbounded (§4.4). Second, the register records official results, not subjective experience — nor injury, a leading cause of attrition in this sport,</w:t>
       </w:r>
       <w:r>
+        <w:rPr>
+          <w:vertAlign w:val="superscript"/>
+        </w:rPr>
         <w:t xml:space="preserve">3</w:t>
       </w:r>
       <w:r>

</xml_diff>

<commit_message>
Build named (non-anonymized) IJSSC submission package
IJSSC uses open review: author block (name, affiliation, corresponding
details, ORCID) now injected into MANUSCRIPT_IJSSC after the title, and
main-figure captions appended after references. Fresh upload set built:
TABLES_IJSSC.docx (Tables 1-7), SUPPLEMENT_IJSSC.docx (extended methods
+ S-tables + S-captions + STROBE checklist), COVER_LETTER_IJSSC.docx,
TITLE_PAGE_IJSSC.docx (running title updated, PSE anonymization note
removed, ORCID added). All figures confirmed 300 dpi.

Co-Authored-By: Claude Fable 5 <noreply@anthropic.com>
</commit_message>
<xml_diff>
--- a/forskning/ncc-kohort/submission_pse/MANUSCRIPT_IJSSC.docx
+++ b/forskning/ncc-kohort/submission_pse/MANUSCRIPT_IJSSC.docx
@@ -2,7 +2,7 @@
 <file path=word/document.xml><?xml version="1.0" encoding="utf-8"?>
 <w:document xmlns:w="http://schemas.openxmlformats.org/wordprocessingml/2006/main" xmlns:m="http://schemas.openxmlformats.org/officeDocument/2006/math" xmlns:r="http://schemas.openxmlformats.org/officeDocument/2006/relationships" xmlns:o="urn:schemas-microsoft-com:office:office" xmlns:v="urn:schemas-microsoft-com:vml" xmlns:w10="urn:schemas-microsoft-com:office:word" xmlns:a="http://schemas.openxmlformats.org/drawingml/2006/main" xmlns:pic="http://schemas.openxmlformats.org/drawingml/2006/picture" xmlns:wp="http://schemas.openxmlformats.org/drawingml/2006/wordprocessingDrawing">
   <w:body>
-    <w:bookmarkStart w:id="65" w:name="Xc35107a2ed49a74c8ee51c8c78122e736058acc"/>
+    <w:bookmarkStart w:id="66" w:name="Xc35107a2ed49a74c8ee51c8c78122e736058acc"/>
     <w:p>
       <w:pPr>
         <w:pStyle w:val="Heading1"/>
@@ -14,6 +14,42 @@
     <w:p>
       <w:pPr>
         <w:pStyle w:val="FirstParagraph"/>
+      </w:pPr>
+      <w:r>
+        <w:rPr>
+          <w:b/>
+          <w:bCs/>
+        </w:rPr>
+        <w:t xml:space="preserve">Atle Guttormsen</w:t>
+      </w:r>
+      <w:r>
+        <w:t xml:space="preserve"> </w:t>
+      </w:r>
+      <w:r>
+        <w:t xml:space="preserve">School of Economics and Business, Norwegian University of Life Sciences (NMBU), Ås, Norway</w:t>
+      </w:r>
+    </w:p>
+    <w:p>
+      <w:pPr>
+        <w:pStyle w:val="BodyText"/>
+      </w:pPr>
+      <w:r>
+        <w:rPr>
+          <w:b/>
+          <w:bCs/>
+        </w:rPr>
+        <w:t xml:space="preserve">Corresponding author:</w:t>
+      </w:r>
+      <w:r>
+        <w:t xml:space="preserve"> </w:t>
+      </w:r>
+      <w:r>
+        <w:t xml:space="preserve">Atle Guttormsen, School of Economics and Business, Norwegian University of Life Sciences (NMBU), Universitetstunet 3, 1433 Ås, Norway. Email: atle.guttormsen@nmbu.no. ORCID: 0000-0003-0188-8462.</w:t>
+      </w:r>
+    </w:p>
+    <w:p>
+      <w:pPr>
+        <w:pStyle w:val="BodyText"/>
       </w:pPr>
       <w:r>
         <w:rPr>
@@ -3971,7 +4007,71 @@
       </w:r>
     </w:p>
     <w:bookmarkEnd w:id="64"/>
+    <w:bookmarkStart w:id="65" w:name="figure-captions"/>
+    <w:p>
+      <w:pPr>
+        <w:pStyle w:val="Heading2"/>
+      </w:pPr>
+      <w:r>
+        <w:t xml:space="preserve">Figure captions</w:t>
+      </w:r>
+    </w:p>
+    <w:p>
+      <w:pPr>
+        <w:pStyle w:val="FirstParagraph"/>
+      </w:pPr>
+      <w:r>
+        <w:rPr>
+          <w:b/>
+          <w:bCs/>
+        </w:rPr>
+        <w:t xml:space="preserve">Figure 1.</w:t>
+      </w:r>
+      <w:r>
+        <w:t xml:space="preserve"> </w:t>
+      </w:r>
+      <w:r>
+        <w:t xml:space="preserve">A behavioral-marker model of youth-sport disengagement. The diagram shows the relationship being tested: theoretical mechanisms hypothesized by the Sport Commitment Model and the role-exit / withdrawal-as-process tradition (left) are not directly observed, but are predicted to leave a footprint in measurable competition behavior (centre), which precedes the outcome of active senior retention (right).</w:t>
+      </w:r>
+    </w:p>
+    <w:p>
+      <w:pPr>
+        <w:pStyle w:val="BodyText"/>
+      </w:pPr>
+      <w:r>
+        <w:rPr>
+          <w:b/>
+          <w:bCs/>
+        </w:rPr>
+        <w:t xml:space="preserve">Figure 2.</w:t>
+      </w:r>
+      <w:r>
+        <w:t xml:space="preserve"> </w:t>
+      </w:r>
+      <w:r>
+        <w:t xml:space="preserve">Competition volume trajectory by senior-retention status. Median competitions per year (with interquartile range as shaded band) plotted by athlete age (13–18), separately for athletes who retained active senior status (≥2 results in any year at age ≥20; n = 348) and those who did not (n = 1,775). The dashed vertical line at age 15 marks the first qualification milestone (Norwegian Youth Championships). Future retainers and future dropouts already differ at ages 13–14; the gap widens further across the age-14-to-15 transition.</w:t>
+      </w:r>
+    </w:p>
+    <w:p>
+      <w:pPr>
+        <w:pStyle w:val="BodyText"/>
+      </w:pPr>
+      <w:r>
+        <w:rPr>
+          <w:b/>
+          <w:bCs/>
+        </w:rPr>
+        <w:t xml:space="preserve">Figure 3.</w:t>
+      </w:r>
+      <w:r>
+        <w:t xml:space="preserve"> </w:t>
+      </w:r>
+      <w:r>
+        <w:t xml:space="preserve">Kaplan–Meier retention curves stratified by total competition volume across ages 15 and 16 (descriptive). Strata are: 0 meets, 1–5 meets, 6–15 meets, 16–30 meets, and 31+ meets. Athletes in the highest stratum retained 71% senior activity at follow-up year 14; athletes in the lowest stratum retained 4%. (Note: this descriptive stratification uses post-baseline measurement; primary effect estimates in Table 3 use only baseline-window predictors.)</w:t>
+      </w:r>
+    </w:p>
     <w:bookmarkEnd w:id="65"/>
+    <w:bookmarkEnd w:id="66"/>
     <w:sectPr>
       <w:footnotePr>
         <w:numRestart w:val="eachSect"/>

</xml_diff>

<commit_message>
Embed Tables 1-7 in main IJSSC manuscript; add per-table docx fallback
Tables appended after references in MANUSCRIPT_IJSSC (SAGE accepts
end-of-manuscript tables), avoiding ScholarOne's one-file-per-table
upload flow; tables_individual/Table1-7.docx provided as fallback.

Co-Authored-By: Claude Fable 5 <noreply@anthropic.com>
</commit_message>
<xml_diff>
--- a/forskning/ncc-kohort/submission_pse/MANUSCRIPT_IJSSC.docx
+++ b/forskning/ncc-kohort/submission_pse/MANUSCRIPT_IJSSC.docx
@@ -2,7 +2,7 @@
 <file path=word/document.xml><?xml version="1.0" encoding="utf-8"?>
 <w:document xmlns:w="http://schemas.openxmlformats.org/wordprocessingml/2006/main" xmlns:m="http://schemas.openxmlformats.org/officeDocument/2006/math" xmlns:r="http://schemas.openxmlformats.org/officeDocument/2006/relationships" xmlns:o="urn:schemas-microsoft-com:office:office" xmlns:v="urn:schemas-microsoft-com:vml" xmlns:w10="urn:schemas-microsoft-com:office:word" xmlns:a="http://schemas.openxmlformats.org/drawingml/2006/main" xmlns:pic="http://schemas.openxmlformats.org/drawingml/2006/picture" xmlns:wp="http://schemas.openxmlformats.org/drawingml/2006/wordprocessingDrawing">
   <w:body>
-    <w:bookmarkStart w:id="66" w:name="Xc35107a2ed49a74c8ee51c8c78122e736058acc"/>
+    <w:bookmarkStart w:id="74" w:name="Xc35107a2ed49a74c8ee51c8c78122e736058acc"/>
     <w:p>
       <w:pPr>
         <w:pStyle w:val="Heading1"/>
@@ -4007,7 +4007,4058 @@
       </w:r>
     </w:p>
     <w:bookmarkEnd w:id="64"/>
-    <w:bookmarkStart w:id="65" w:name="figure-captions"/>
+    <w:bookmarkStart w:id="65" w:name="tables"/>
+    <w:p>
+      <w:pPr>
+        <w:pStyle w:val="Heading2"/>
+      </w:pPr>
+      <w:r>
+        <w:t xml:space="preserve">Tables</w:t>
+      </w:r>
+    </w:p>
+    <w:bookmarkEnd w:id="65"/>
+    <w:bookmarkStart w:id="66" w:name="X3f3effad2eaa83c7207be569d73957223d2e30a"/>
+    <w:p>
+      <w:pPr>
+        <w:pStyle w:val="Heading2"/>
+      </w:pPr>
+      <w:r>
+        <w:t xml:space="preserve">Table 1. Cohort characteristics by birth-year cohort</w:t>
+      </w:r>
+    </w:p>
+    <w:tbl>
+      <w:tblPr>
+        <w:tblStyle w:val="Table"/>
+        <w:tblW w:type="pct" w:w="5000"/>
+        <w:tblLayout w:type="fixed"/>
+        <w:tblLook w:firstRow="1" w:lastRow="0" w:firstColumn="0" w:lastColumn="0" w:noHBand="0" w:noVBand="0" w:val="0020"/>
+      </w:tblPr>
+      <w:tblGrid>
+        <w:gridCol w:w="1980"/>
+        <w:gridCol w:w="1980"/>
+        <w:gridCol w:w="1980"/>
+        <w:gridCol w:w="1980"/>
+      </w:tblGrid>
+      <w:tr>
+        <w:trPr>
+          <w:tblHeader w:val="on"/>
+        </w:trPr>
+        <w:tc>
+          <w:tcPr/>
+          <w:p>
+            <w:pPr>
+              <w:pStyle w:val="Compact"/>
+            </w:pPr>
+            <w:r>
+              <w:t xml:space="preserve">Characteristic</w:t>
+            </w:r>
+          </w:p>
+        </w:tc>
+        <w:tc>
+          <w:tcPr/>
+          <w:p>
+            <w:pPr>
+              <w:pStyle w:val="Compact"/>
+            </w:pPr>
+            <w:r>
+              <w:t xml:space="preserve">Cohort A (1998–2000)</w:t>
+            </w:r>
+          </w:p>
+        </w:tc>
+        <w:tc>
+          <w:tcPr/>
+          <w:p>
+            <w:pPr>
+              <w:pStyle w:val="Compact"/>
+            </w:pPr>
+            <w:r>
+              <w:t xml:space="preserve">Cohort B (2001–2002)</w:t>
+            </w:r>
+          </w:p>
+        </w:tc>
+        <w:tc>
+          <w:tcPr/>
+          <w:p>
+            <w:pPr>
+              <w:pStyle w:val="Compact"/>
+            </w:pPr>
+            <w:r>
+              <w:t xml:space="preserve">All cohorts</w:t>
+            </w:r>
+          </w:p>
+        </w:tc>
+      </w:tr>
+      <w:tr>
+        <w:tc>
+          <w:tcPr/>
+          <w:p>
+            <w:pPr>
+              <w:pStyle w:val="Compact"/>
+            </w:pPr>
+            <w:r>
+              <w:t xml:space="preserve">N</w:t>
+            </w:r>
+          </w:p>
+        </w:tc>
+        <w:tc>
+          <w:tcPr/>
+          <w:p>
+            <w:pPr>
+              <w:pStyle w:val="Compact"/>
+            </w:pPr>
+            <w:r>
+              <w:t xml:space="preserve">1,301</w:t>
+            </w:r>
+          </w:p>
+        </w:tc>
+        <w:tc>
+          <w:tcPr/>
+          <w:p>
+            <w:pPr>
+              <w:pStyle w:val="Compact"/>
+            </w:pPr>
+            <w:r>
+              <w:t xml:space="preserve">822</w:t>
+            </w:r>
+          </w:p>
+        </w:tc>
+        <w:tc>
+          <w:tcPr/>
+          <w:p>
+            <w:pPr>
+              <w:pStyle w:val="Compact"/>
+            </w:pPr>
+            <w:r>
+              <w:t xml:space="preserve">2,123</w:t>
+            </w:r>
+          </w:p>
+        </w:tc>
+      </w:tr>
+      <w:tr>
+        <w:tc>
+          <w:tcPr/>
+          <w:p>
+            <w:pPr>
+              <w:pStyle w:val="Compact"/>
+            </w:pPr>
+            <w:r>
+              <w:t xml:space="preserve">Male (n)</w:t>
+            </w:r>
+          </w:p>
+        </w:tc>
+        <w:tc>
+          <w:tcPr/>
+          <w:p>
+            <w:pPr>
+              <w:pStyle w:val="Compact"/>
+            </w:pPr>
+            <w:r>
+              <w:t xml:space="preserve">603</w:t>
+            </w:r>
+          </w:p>
+        </w:tc>
+        <w:tc>
+          <w:tcPr/>
+          <w:p>
+            <w:pPr>
+              <w:pStyle w:val="Compact"/>
+            </w:pPr>
+            <w:r>
+              <w:t xml:space="preserve">393</w:t>
+            </w:r>
+          </w:p>
+        </w:tc>
+        <w:tc>
+          <w:tcPr/>
+          <w:p>
+            <w:pPr>
+              <w:pStyle w:val="Compact"/>
+            </w:pPr>
+            <w:r>
+              <w:t xml:space="preserve">996</w:t>
+            </w:r>
+          </w:p>
+        </w:tc>
+      </w:tr>
+      <w:tr>
+        <w:tc>
+          <w:tcPr/>
+          <w:p>
+            <w:pPr>
+              <w:pStyle w:val="Compact"/>
+            </w:pPr>
+            <w:r>
+              <w:t xml:space="preserve">Female (n)</w:t>
+            </w:r>
+          </w:p>
+        </w:tc>
+        <w:tc>
+          <w:tcPr/>
+          <w:p>
+            <w:pPr>
+              <w:pStyle w:val="Compact"/>
+            </w:pPr>
+            <w:r>
+              <w:t xml:space="preserve">684</w:t>
+            </w:r>
+          </w:p>
+        </w:tc>
+        <w:tc>
+          <w:tcPr/>
+          <w:p>
+            <w:pPr>
+              <w:pStyle w:val="Compact"/>
+            </w:pPr>
+            <w:r>
+              <w:t xml:space="preserve">419</w:t>
+            </w:r>
+          </w:p>
+        </w:tc>
+        <w:tc>
+          <w:tcPr/>
+          <w:p>
+            <w:pPr>
+              <w:pStyle w:val="Compact"/>
+            </w:pPr>
+            <w:r>
+              <w:t xml:space="preserve">1,103</w:t>
+            </w:r>
+          </w:p>
+        </w:tc>
+      </w:tr>
+      <w:tr>
+        <w:tc>
+          <w:tcPr/>
+          <w:p>
+            <w:pPr>
+              <w:pStyle w:val="Compact"/>
+            </w:pPr>
+            <w:r>
+              <w:t xml:space="preserve">Sex unknown (n)</w:t>
+            </w:r>
+          </w:p>
+        </w:tc>
+        <w:tc>
+          <w:tcPr/>
+          <w:p>
+            <w:pPr>
+              <w:pStyle w:val="Compact"/>
+            </w:pPr>
+            <w:r>
+              <w:t xml:space="preserve">14</w:t>
+            </w:r>
+          </w:p>
+        </w:tc>
+        <w:tc>
+          <w:tcPr/>
+          <w:p>
+            <w:pPr>
+              <w:pStyle w:val="Compact"/>
+            </w:pPr>
+            <w:r>
+              <w:t xml:space="preserve">10</w:t>
+            </w:r>
+          </w:p>
+        </w:tc>
+        <w:tc>
+          <w:tcPr/>
+          <w:p>
+            <w:pPr>
+              <w:pStyle w:val="Compact"/>
+            </w:pPr>
+            <w:r>
+              <w:t xml:space="preserve">24</w:t>
+            </w:r>
+          </w:p>
+        </w:tc>
+      </w:tr>
+      <w:tr>
+        <w:tc>
+          <w:tcPr/>
+          <w:p>
+            <w:pPr>
+              <w:pStyle w:val="Compact"/>
+            </w:pPr>
+            <w:r>
+              <w:t xml:space="preserve">Median career length (years)</w:t>
+            </w:r>
+          </w:p>
+        </w:tc>
+        <w:tc>
+          <w:tcPr/>
+          <w:p>
+            <w:pPr>
+              <w:pStyle w:val="Compact"/>
+            </w:pPr>
+            <w:r>
+              <w:t xml:space="preserve">2.0</w:t>
+            </w:r>
+          </w:p>
+        </w:tc>
+        <w:tc>
+          <w:tcPr/>
+          <w:p>
+            <w:pPr>
+              <w:pStyle w:val="Compact"/>
+            </w:pPr>
+            <w:r>
+              <w:t xml:space="preserve">3.0</w:t>
+            </w:r>
+          </w:p>
+        </w:tc>
+        <w:tc>
+          <w:tcPr/>
+          <w:p>
+            <w:pPr>
+              <w:pStyle w:val="Compact"/>
+            </w:pPr>
+            <w:r>
+              <w:t xml:space="preserve">2.0</w:t>
+            </w:r>
+          </w:p>
+        </w:tc>
+      </w:tr>
+      <w:tr>
+        <w:tc>
+          <w:tcPr/>
+          <w:p>
+            <w:pPr>
+              <w:pStyle w:val="Compact"/>
+            </w:pPr>
+            <w:r>
+              <w:t xml:space="preserve">Active at age 17 (%)</w:t>
+            </w:r>
+          </w:p>
+        </w:tc>
+        <w:tc>
+          <w:tcPr/>
+          <w:p>
+            <w:pPr>
+              <w:pStyle w:val="Compact"/>
+            </w:pPr>
+            <w:r>
+              <w:t xml:space="preserve">41.0</w:t>
+            </w:r>
+          </w:p>
+        </w:tc>
+        <w:tc>
+          <w:tcPr/>
+          <w:p>
+            <w:pPr>
+              <w:pStyle w:val="Compact"/>
+            </w:pPr>
+            <w:r>
+              <w:t xml:space="preserve">41.6</w:t>
+            </w:r>
+          </w:p>
+        </w:tc>
+        <w:tc>
+          <w:tcPr/>
+          <w:p>
+            <w:pPr>
+              <w:pStyle w:val="Compact"/>
+            </w:pPr>
+            <w:r>
+              <w:t xml:space="preserve">41.3</w:t>
+            </w:r>
+          </w:p>
+        </w:tc>
+      </w:tr>
+      <w:tr>
+        <w:tc>
+          <w:tcPr/>
+          <w:p>
+            <w:pPr>
+              <w:pStyle w:val="Compact"/>
+            </w:pPr>
+            <w:r>
+              <w:t xml:space="preserve">Ever active at age 20+ (%)</w:t>
+            </w:r>
+          </w:p>
+        </w:tc>
+        <w:tc>
+          <w:tcPr/>
+          <w:p>
+            <w:pPr>
+              <w:pStyle w:val="Compact"/>
+            </w:pPr>
+            <w:r>
+              <w:t xml:space="preserve">15.8</w:t>
+            </w:r>
+          </w:p>
+        </w:tc>
+        <w:tc>
+          <w:tcPr/>
+          <w:p>
+            <w:pPr>
+              <w:pStyle w:val="Compact"/>
+            </w:pPr>
+            <w:r>
+              <w:t xml:space="preserve">17.3</w:t>
+            </w:r>
+          </w:p>
+        </w:tc>
+        <w:tc>
+          <w:tcPr/>
+          <w:p>
+            <w:pPr>
+              <w:pStyle w:val="Compact"/>
+            </w:pPr>
+            <w:r>
+              <w:t xml:space="preserve">16.4</w:t>
+            </w:r>
+          </w:p>
+        </w:tc>
+      </w:tr>
+      <w:tr>
+        <w:tc>
+          <w:tcPr/>
+          <w:p>
+            <w:pPr>
+              <w:pStyle w:val="Compact"/>
+            </w:pPr>
+            <w:r>
+              <w:t xml:space="preserve">Still active in 2024 or later (%)</w:t>
+            </w:r>
+          </w:p>
+        </w:tc>
+        <w:tc>
+          <w:tcPr/>
+          <w:p>
+            <w:pPr>
+              <w:pStyle w:val="Compact"/>
+            </w:pPr>
+            <w:r>
+              <w:t xml:space="preserve">5.8</w:t>
+            </w:r>
+          </w:p>
+        </w:tc>
+        <w:tc>
+          <w:tcPr/>
+          <w:p>
+            <w:pPr>
+              <w:pStyle w:val="Compact"/>
+            </w:pPr>
+            <w:r>
+              <w:t xml:space="preserve">10.8</w:t>
+            </w:r>
+          </w:p>
+        </w:tc>
+        <w:tc>
+          <w:tcPr/>
+          <w:p>
+            <w:pPr>
+              <w:pStyle w:val="Compact"/>
+            </w:pPr>
+            <w:r>
+              <w:t xml:space="preserve">7.7</w:t>
+            </w:r>
+          </w:p>
+        </w:tc>
+      </w:tr>
+      <w:tr>
+        <w:tc>
+          <w:tcPr/>
+          <w:p>
+            <w:pPr>
+              <w:pStyle w:val="Compact"/>
+            </w:pPr>
+            <w:r>
+              <w:t xml:space="preserve">Mean Tyrving best at baseline</w:t>
+            </w:r>
+          </w:p>
+        </w:tc>
+        <w:tc>
+          <w:tcPr/>
+          <w:p>
+            <w:pPr>
+              <w:pStyle w:val="Compact"/>
+            </w:pPr>
+            <w:r>
+              <w:t xml:space="preserve">666</w:t>
+            </w:r>
+          </w:p>
+        </w:tc>
+        <w:tc>
+          <w:tcPr/>
+          <w:p>
+            <w:pPr>
+              <w:pStyle w:val="Compact"/>
+            </w:pPr>
+            <w:r>
+              <w:t xml:space="preserve">666</w:t>
+            </w:r>
+          </w:p>
+        </w:tc>
+        <w:tc>
+          <w:tcPr/>
+          <w:p>
+            <w:pPr>
+              <w:pStyle w:val="Compact"/>
+            </w:pPr>
+            <w:r>
+              <w:t xml:space="preserve">666</w:t>
+            </w:r>
+          </w:p>
+        </w:tc>
+      </w:tr>
+      <w:tr>
+        <w:tc>
+          <w:tcPr/>
+          <w:p>
+            <w:pPr>
+              <w:pStyle w:val="Compact"/>
+            </w:pPr>
+            <w:r>
+              <w:t xml:space="preserve">Median total meets, ages 13–14 (pre-milestone volume)</w:t>
+            </w:r>
+          </w:p>
+        </w:tc>
+        <w:tc>
+          <w:tcPr/>
+          <w:p>
+            <w:pPr>
+              <w:pStyle w:val="Compact"/>
+            </w:pPr>
+            <w:r>
+              <w:t xml:space="preserve">16</w:t>
+            </w:r>
+          </w:p>
+        </w:tc>
+        <w:tc>
+          <w:tcPr/>
+          <w:p>
+            <w:pPr>
+              <w:pStyle w:val="Compact"/>
+            </w:pPr>
+            <w:r>
+              <w:t xml:space="preserve">19</w:t>
+            </w:r>
+          </w:p>
+        </w:tc>
+        <w:tc>
+          <w:tcPr/>
+          <w:p>
+            <w:pPr>
+              <w:pStyle w:val="Compact"/>
+            </w:pPr>
+            <w:r>
+              <w:t xml:space="preserve">17</w:t>
+            </w:r>
+          </w:p>
+        </w:tc>
+      </w:tr>
+    </w:tbl>
+    <w:p>
+      <w:pPr>
+        <w:pStyle w:val="BodyText"/>
+      </w:pPr>
+      <w:r>
+        <w:rPr>
+          <w:i/>
+          <w:iCs/>
+        </w:rPr>
+        <w:t xml:space="preserve">Note.</w:t>
+      </w:r>
+      <w:r>
+        <w:t xml:space="preserve"> </w:t>
+      </w:r>
+      <w:r>
+        <w:t xml:space="preserve">“Active at age 17”</w:t>
+      </w:r>
+      <w:r>
+        <w:t xml:space="preserve"> </w:t>
+      </w:r>
+      <w:r>
+        <w:t xml:space="preserve">indicates ≥2 registered competition results in the athlete’s age-17 calendar year;</w:t>
+      </w:r>
+      <w:r>
+        <w:t xml:space="preserve"> </w:t>
+      </w:r>
+      <w:r>
+        <w:t xml:space="preserve">“Ever active at age 20+”</w:t>
+      </w:r>
+      <w:r>
+        <w:t xml:space="preserve"> </w:t>
+      </w:r>
+      <w:r>
+        <w:t xml:space="preserve">is the outcome prevalence (≥2 results in any calendar year at age 20 or later). Tyrving points = the Norwegian Athletics Federation’s age-norm score, where 1,000 corresponds to the published reference performance for that event × sex × age combination.</w:t>
+      </w:r>
+    </w:p>
+    <w:p>
+      <w:r>
+        <w:pict>
+          <v:rect style="width:0;height:1.5pt" o:hralign="center" o:hrstd="t" o:hr="t"/>
+        </w:pict>
+      </w:r>
+    </w:p>
+    <w:bookmarkEnd w:id="66"/>
+    <w:bookmarkStart w:id="67" w:name="X9a6c38783434298188d0179517197b4d55f1fe6"/>
+    <w:p>
+      <w:pPr>
+        <w:pStyle w:val="Heading2"/>
+      </w:pPr>
+      <w:r>
+        <w:t xml:space="preserve">Table 2. Competition volume trajectory by senior-retention status (median competitions per year and IQR)</w:t>
+      </w:r>
+    </w:p>
+    <w:tbl>
+      <w:tblPr>
+        <w:tblStyle w:val="Table"/>
+        <w:tblW w:type="pct" w:w="5000"/>
+        <w:tblLayout w:type="fixed"/>
+        <w:tblLook w:firstRow="1" w:lastRow="0" w:firstColumn="0" w:lastColumn="0" w:noHBand="0" w:noVBand="0" w:val="0020"/>
+      </w:tblPr>
+      <w:tblGrid>
+        <w:gridCol w:w="990"/>
+        <w:gridCol w:w="990"/>
+        <w:gridCol w:w="990"/>
+        <w:gridCol w:w="990"/>
+        <w:gridCol w:w="990"/>
+        <w:gridCol w:w="990"/>
+        <w:gridCol w:w="990"/>
+        <w:gridCol w:w="990"/>
+      </w:tblGrid>
+      <w:tr>
+        <w:trPr>
+          <w:tblHeader w:val="on"/>
+        </w:trPr>
+        <w:tc>
+          <w:tcPr/>
+          <w:p>
+            <w:pPr>
+              <w:pStyle w:val="Compact"/>
+            </w:pPr>
+            <w:r>
+              <w:t xml:space="preserve">Group</w:t>
+            </w:r>
+          </w:p>
+        </w:tc>
+        <w:tc>
+          <w:tcPr/>
+          <w:p>
+            <w:pPr>
+              <w:pStyle w:val="Compact"/>
+            </w:pPr>
+            <w:r>
+              <w:t xml:space="preserve">N</w:t>
+            </w:r>
+          </w:p>
+        </w:tc>
+        <w:tc>
+          <w:tcPr/>
+          <w:p>
+            <w:pPr>
+              <w:pStyle w:val="Compact"/>
+            </w:pPr>
+            <w:r>
+              <w:t xml:space="preserve">Age 13</w:t>
+            </w:r>
+          </w:p>
+        </w:tc>
+        <w:tc>
+          <w:tcPr/>
+          <w:p>
+            <w:pPr>
+              <w:pStyle w:val="Compact"/>
+            </w:pPr>
+            <w:r>
+              <w:t xml:space="preserve">Age 14</w:t>
+            </w:r>
+          </w:p>
+        </w:tc>
+        <w:tc>
+          <w:tcPr/>
+          <w:p>
+            <w:pPr>
+              <w:pStyle w:val="Compact"/>
+            </w:pPr>
+            <w:r>
+              <w:t xml:space="preserve">Age 15</w:t>
+            </w:r>
+          </w:p>
+        </w:tc>
+        <w:tc>
+          <w:tcPr/>
+          <w:p>
+            <w:pPr>
+              <w:pStyle w:val="Compact"/>
+            </w:pPr>
+            <w:r>
+              <w:t xml:space="preserve">Age 16</w:t>
+            </w:r>
+          </w:p>
+        </w:tc>
+        <w:tc>
+          <w:tcPr/>
+          <w:p>
+            <w:pPr>
+              <w:pStyle w:val="Compact"/>
+            </w:pPr>
+            <w:r>
+              <w:t xml:space="preserve">Age 17</w:t>
+            </w:r>
+          </w:p>
+        </w:tc>
+        <w:tc>
+          <w:tcPr/>
+          <w:p>
+            <w:pPr>
+              <w:pStyle w:val="Compact"/>
+            </w:pPr>
+            <w:r>
+              <w:t xml:space="preserve">Age 18</w:t>
+            </w:r>
+          </w:p>
+        </w:tc>
+      </w:tr>
+      <w:tr>
+        <w:tc>
+          <w:tcPr/>
+          <w:p>
+            <w:pPr>
+              <w:pStyle w:val="Compact"/>
+            </w:pPr>
+            <w:r>
+              <w:t xml:space="preserve">Senior retainers (active age ≥20)</w:t>
+            </w:r>
+          </w:p>
+        </w:tc>
+        <w:tc>
+          <w:tcPr/>
+          <w:p>
+            <w:pPr>
+              <w:pStyle w:val="Compact"/>
+            </w:pPr>
+            <w:r>
+              <w:t xml:space="preserve">348</w:t>
+            </w:r>
+          </w:p>
+        </w:tc>
+        <w:tc>
+          <w:tcPr/>
+          <w:p>
+            <w:pPr>
+              <w:pStyle w:val="Compact"/>
+            </w:pPr>
+            <w:r>
+              <w:t xml:space="preserve">13 [6–21]</w:t>
+            </w:r>
+          </w:p>
+        </w:tc>
+        <w:tc>
+          <w:tcPr/>
+          <w:p>
+            <w:pPr>
+              <w:pStyle w:val="Compact"/>
+            </w:pPr>
+            <w:r>
+              <w:t xml:space="preserve">17 [10–25]</w:t>
+            </w:r>
+          </w:p>
+        </w:tc>
+        <w:tc>
+          <w:tcPr/>
+          <w:p>
+            <w:pPr>
+              <w:pStyle w:val="Compact"/>
+            </w:pPr>
+            <w:r>
+              <w:t xml:space="preserve">19 [11–27]</w:t>
+            </w:r>
+          </w:p>
+        </w:tc>
+        <w:tc>
+          <w:tcPr/>
+          <w:p>
+            <w:pPr>
+              <w:pStyle w:val="Compact"/>
+            </w:pPr>
+            <w:r>
+              <w:t xml:space="preserve">18 [10–26]</w:t>
+            </w:r>
+          </w:p>
+        </w:tc>
+        <w:tc>
+          <w:tcPr/>
+          <w:p>
+            <w:pPr>
+              <w:pStyle w:val="Compact"/>
+            </w:pPr>
+            <w:r>
+              <w:t xml:space="preserve">17 [10–24]</w:t>
+            </w:r>
+          </w:p>
+        </w:tc>
+        <w:tc>
+          <w:tcPr/>
+          <w:p>
+            <w:pPr>
+              <w:pStyle w:val="Compact"/>
+            </w:pPr>
+            <w:r>
+              <w:t xml:space="preserve">14 [7–20]</w:t>
+            </w:r>
+          </w:p>
+        </w:tc>
+      </w:tr>
+      <w:tr>
+        <w:tc>
+          <w:tcPr/>
+          <w:p>
+            <w:pPr>
+              <w:pStyle w:val="Compact"/>
+            </w:pPr>
+            <w:r>
+              <w:t xml:space="preserve">Dropouts (last active age &lt;20)</w:t>
+            </w:r>
+          </w:p>
+        </w:tc>
+        <w:tc>
+          <w:tcPr/>
+          <w:p>
+            <w:pPr>
+              <w:pStyle w:val="Compact"/>
+            </w:pPr>
+            <w:r>
+              <w:t xml:space="preserve">1,775</w:t>
+            </w:r>
+          </w:p>
+        </w:tc>
+        <w:tc>
+          <w:tcPr/>
+          <w:p>
+            <w:pPr>
+              <w:pStyle w:val="Compact"/>
+            </w:pPr>
+            <w:r>
+              <w:t xml:space="preserve">8 [4–13]</w:t>
+            </w:r>
+          </w:p>
+        </w:tc>
+        <w:tc>
+          <w:tcPr/>
+          <w:p>
+            <w:pPr>
+              <w:pStyle w:val="Compact"/>
+            </w:pPr>
+            <w:r>
+              <w:t xml:space="preserve">8 [3–14]</w:t>
+            </w:r>
+          </w:p>
+        </w:tc>
+        <w:tc>
+          <w:tcPr/>
+          <w:p>
+            <w:pPr>
+              <w:pStyle w:val="Compact"/>
+            </w:pPr>
+            <w:r>
+              <w:t xml:space="preserve">3 [0–11]</w:t>
+            </w:r>
+          </w:p>
+        </w:tc>
+        <w:tc>
+          <w:tcPr/>
+          <w:p>
+            <w:pPr>
+              <w:pStyle w:val="Compact"/>
+            </w:pPr>
+            <w:r>
+              <w:t xml:space="preserve">0 [0–7]</w:t>
+            </w:r>
+          </w:p>
+        </w:tc>
+        <w:tc>
+          <w:tcPr/>
+          <w:p>
+            <w:pPr>
+              <w:pStyle w:val="Compact"/>
+            </w:pPr>
+            <w:r>
+              <w:t xml:space="preserve">0 [0–2]</w:t>
+            </w:r>
+          </w:p>
+        </w:tc>
+        <w:tc>
+          <w:tcPr/>
+          <w:p>
+            <w:pPr>
+              <w:pStyle w:val="Compact"/>
+            </w:pPr>
+            <w:r>
+              <w:t xml:space="preserve">0 [0–0]</w:t>
+            </w:r>
+          </w:p>
+        </w:tc>
+      </w:tr>
+    </w:tbl>
+    <w:p>
+      <w:pPr>
+        <w:pStyle w:val="BodyText"/>
+      </w:pPr>
+      <w:r>
+        <w:rPr>
+          <w:i/>
+          <w:iCs/>
+        </w:rPr>
+        <w:t xml:space="preserve">Note.</w:t>
+      </w:r>
+      <w:r>
+        <w:t xml:space="preserve"> </w:t>
+      </w:r>
+      <w:r>
+        <w:t xml:space="preserve">Values are median number of meets per year [IQR]. Future retainers and future dropouts already differ at ages 13–14; the gap widens further across the age-14-to-15 transition.</w:t>
+      </w:r>
+    </w:p>
+    <w:p>
+      <w:r>
+        <w:pict>
+          <v:rect style="width:0;height:1.5pt" o:hralign="center" o:hrstd="t" o:hr="t"/>
+        </w:pict>
+      </w:r>
+    </w:p>
+    <w:bookmarkEnd w:id="67"/>
+    <w:bookmarkStart w:id="68" w:name="Xb8cde947c4ddc1e5df834e78ab22bae1a1fbba6"/>
+    <w:p>
+      <w:pPr>
+        <w:pStyle w:val="Heading2"/>
+      </w:pPr>
+      <w:r>
+        <w:t xml:space="preserve">Table 3. Primary analysis: prospective logistic regression for active senior status (baseline-only predictors, ages 13–14)</w:t>
+      </w:r>
+    </w:p>
+    <w:tbl>
+      <w:tblPr>
+        <w:tblStyle w:val="Table"/>
+        <w:tblW w:type="pct" w:w="5000"/>
+        <w:tblLayout w:type="fixed"/>
+        <w:tblLook w:firstRow="1" w:lastRow="0" w:firstColumn="0" w:lastColumn="0" w:noHBand="0" w:noVBand="0" w:val="0020"/>
+      </w:tblPr>
+      <w:tblGrid>
+        <w:gridCol w:w="1131"/>
+        <w:gridCol w:w="1131"/>
+        <w:gridCol w:w="1131"/>
+        <w:gridCol w:w="1131"/>
+        <w:gridCol w:w="1131"/>
+        <w:gridCol w:w="1131"/>
+        <w:gridCol w:w="1131"/>
+      </w:tblGrid>
+      <w:tr>
+        <w:trPr>
+          <w:tblHeader w:val="on"/>
+        </w:trPr>
+        <w:tc>
+          <w:tcPr/>
+          <w:p>
+            <w:pPr>
+              <w:pStyle w:val="Compact"/>
+            </w:pPr>
+            <w:r>
+              <w:t xml:space="preserve">Model</w:t>
+            </w:r>
+          </w:p>
+        </w:tc>
+        <w:tc>
+          <w:tcPr/>
+          <w:p>
+            <w:pPr>
+              <w:pStyle w:val="Compact"/>
+            </w:pPr>
+            <w:r>
+              <w:t xml:space="preserve">Covariate</w:t>
+            </w:r>
+          </w:p>
+        </w:tc>
+        <w:tc>
+          <w:tcPr/>
+          <w:p>
+            <w:pPr>
+              <w:pStyle w:val="Compact"/>
+            </w:pPr>
+            <w:r>
+              <w:t xml:space="preserve">OR</w:t>
+            </w:r>
+          </w:p>
+        </w:tc>
+        <w:tc>
+          <w:tcPr/>
+          <w:p>
+            <w:pPr>
+              <w:pStyle w:val="Compact"/>
+            </w:pPr>
+            <w:r>
+              <w:t xml:space="preserve">95% CI</w:t>
+            </w:r>
+          </w:p>
+        </w:tc>
+        <w:tc>
+          <w:tcPr/>
+          <w:p>
+            <w:pPr>
+              <w:pStyle w:val="Compact"/>
+            </w:pPr>
+            <w:r>
+              <w:t xml:space="preserve">p</w:t>
+            </w:r>
+          </w:p>
+        </w:tc>
+        <w:tc>
+          <w:tcPr/>
+          <w:p>
+            <w:pPr>
+              <w:pStyle w:val="Compact"/>
+            </w:pPr>
+            <w:r>
+              <w:t xml:space="preserve">CV-AUC</w:t>
+            </w:r>
+          </w:p>
+        </w:tc>
+        <w:tc>
+          <w:tcPr/>
+          <w:p>
+            <w:pPr>
+              <w:pStyle w:val="Compact"/>
+            </w:pPr>
+            <w:r>
+              <w:t xml:space="preserve">n</w:t>
+            </w:r>
+          </w:p>
+        </w:tc>
+      </w:tr>
+      <w:tr>
+        <w:tc>
+          <w:tcPr/>
+          <w:p>
+            <w:pPr>
+              <w:pStyle w:val="Compact"/>
+            </w:pPr>
+            <w:r>
+              <w:t xml:space="preserve">L1: Sex only</w:t>
+            </w:r>
+          </w:p>
+        </w:tc>
+        <w:tc>
+          <w:tcPr/>
+          <w:p>
+            <w:pPr>
+              <w:pStyle w:val="Compact"/>
+            </w:pPr>
+            <w:r>
+              <w:t xml:space="preserve">Female</w:t>
+            </w:r>
+          </w:p>
+        </w:tc>
+        <w:tc>
+          <w:tcPr/>
+          <w:p>
+            <w:pPr>
+              <w:pStyle w:val="Compact"/>
+            </w:pPr>
+            <w:r>
+              <w:t xml:space="preserve">0.72</w:t>
+            </w:r>
+          </w:p>
+        </w:tc>
+        <w:tc>
+          <w:tcPr/>
+          <w:p>
+            <w:pPr>
+              <w:pStyle w:val="Compact"/>
+            </w:pPr>
+            <w:r>
+              <w:t xml:space="preserve">[0.56, 0.93]</w:t>
+            </w:r>
+          </w:p>
+        </w:tc>
+        <w:tc>
+          <w:tcPr/>
+          <w:p>
+            <w:pPr>
+              <w:pStyle w:val="Compact"/>
+            </w:pPr>
+            <w:r>
+              <w:t xml:space="preserve">.012</w:t>
+            </w:r>
+          </w:p>
+        </w:tc>
+        <w:tc>
+          <w:tcPr/>
+          <w:p>
+            <w:pPr>
+              <w:pStyle w:val="Compact"/>
+            </w:pPr>
+            <w:r>
+              <w:t xml:space="preserve">0.541 (±0.023)</w:t>
+            </w:r>
+          </w:p>
+        </w:tc>
+        <w:tc>
+          <w:tcPr/>
+          <w:p>
+            <w:pPr>
+              <w:pStyle w:val="Compact"/>
+            </w:pPr>
+            <w:r>
+              <w:t xml:space="preserve">1,704</w:t>
+            </w:r>
+          </w:p>
+        </w:tc>
+      </w:tr>
+      <w:tr>
+        <w:tc>
+          <w:tcPr/>
+          <w:p>
+            <w:pPr>
+              <w:pStyle w:val="Compact"/>
+            </w:pPr>
+            <w:r>
+              <w:t xml:space="preserve">L2: + Performance</w:t>
+            </w:r>
+          </w:p>
+        </w:tc>
+        <w:tc>
+          <w:tcPr/>
+          <w:p>
+            <w:pPr>
+              <w:pStyle w:val="Compact"/>
+            </w:pPr>
+            <w:r>
+              <w:t xml:space="preserve">Female</w:t>
+            </w:r>
+          </w:p>
+        </w:tc>
+        <w:tc>
+          <w:tcPr/>
+          <w:p>
+            <w:pPr>
+              <w:pStyle w:val="Compact"/>
+            </w:pPr>
+            <w:r>
+              <w:t xml:space="preserve">0.68</w:t>
+            </w:r>
+          </w:p>
+        </w:tc>
+        <w:tc>
+          <w:tcPr/>
+          <w:p>
+            <w:pPr>
+              <w:pStyle w:val="Compact"/>
+            </w:pPr>
+            <w:r>
+              <w:t xml:space="preserve">[0.52, 0.88]</w:t>
+            </w:r>
+          </w:p>
+        </w:tc>
+        <w:tc>
+          <w:tcPr/>
+          <w:p>
+            <w:pPr>
+              <w:pStyle w:val="Compact"/>
+            </w:pPr>
+            <w:r>
+              <w:t xml:space="preserve">.003</w:t>
+            </w:r>
+          </w:p>
+        </w:tc>
+        <w:tc>
+          <w:tcPr/>
+          <w:p>
+            <w:pPr>
+              <w:pStyle w:val="Compact"/>
+            </w:pPr>
+            <w:r>
+              <w:t xml:space="preserve">0.607 (±0.014)</w:t>
+            </w:r>
+          </w:p>
+        </w:tc>
+        <w:tc>
+          <w:tcPr/>
+          <w:p>
+            <w:pPr>
+              <w:pStyle w:val="Compact"/>
+            </w:pPr>
+            <w:r>
+              <w:t xml:space="preserve">1,704</w:t>
+            </w:r>
+          </w:p>
+        </w:tc>
+      </w:tr>
+      <w:tr>
+        <w:tc>
+          <w:tcPr/>
+          <w:p>
+            <w:pPr>
+              <w:pStyle w:val="Compact"/>
+            </w:pPr>
+          </w:p>
+        </w:tc>
+        <w:tc>
+          <w:tcPr/>
+          <w:p>
+            <w:pPr>
+              <w:pStyle w:val="Compact"/>
+            </w:pPr>
+            <w:r>
+              <w:t xml:space="preserve">Tyrving (z)</w:t>
+            </w:r>
+          </w:p>
+        </w:tc>
+        <w:tc>
+          <w:tcPr/>
+          <w:p>
+            <w:pPr>
+              <w:pStyle w:val="Compact"/>
+            </w:pPr>
+            <w:r>
+              <w:t xml:space="preserve">1.41</w:t>
+            </w:r>
+          </w:p>
+        </w:tc>
+        <w:tc>
+          <w:tcPr/>
+          <w:p>
+            <w:pPr>
+              <w:pStyle w:val="Compact"/>
+            </w:pPr>
+            <w:r>
+              <w:t xml:space="preserve">[1.22, 1.64]</w:t>
+            </w:r>
+          </w:p>
+        </w:tc>
+        <w:tc>
+          <w:tcPr/>
+          <w:p>
+            <w:pPr>
+              <w:pStyle w:val="Compact"/>
+            </w:pPr>
+            <w:r>
+              <w:t xml:space="preserve">&lt; .001</w:t>
+            </w:r>
+          </w:p>
+        </w:tc>
+        <w:tc>
+          <w:tcPr/>
+          <w:p>
+            <w:pPr>
+              <w:pStyle w:val="Compact"/>
+            </w:pPr>
+          </w:p>
+        </w:tc>
+        <w:tc>
+          <w:tcPr/>
+          <w:p>
+            <w:pPr>
+              <w:pStyle w:val="Compact"/>
+            </w:pPr>
+          </w:p>
+        </w:tc>
+      </w:tr>
+      <w:tr>
+        <w:tc>
+          <w:tcPr/>
+          <w:p>
+            <w:pPr>
+              <w:pStyle w:val="Compact"/>
+            </w:pPr>
+            <w:r>
+              <w:t xml:space="preserve">L3: + Specialization</w:t>
+            </w:r>
+          </w:p>
+        </w:tc>
+        <w:tc>
+          <w:tcPr/>
+          <w:p>
+            <w:pPr>
+              <w:pStyle w:val="Compact"/>
+            </w:pPr>
+            <w:r>
+              <w:t xml:space="preserve">Female</w:t>
+            </w:r>
+          </w:p>
+        </w:tc>
+        <w:tc>
+          <w:tcPr/>
+          <w:p>
+            <w:pPr>
+              <w:pStyle w:val="Compact"/>
+            </w:pPr>
+            <w:r>
+              <w:t xml:space="preserve">0.68</w:t>
+            </w:r>
+          </w:p>
+        </w:tc>
+        <w:tc>
+          <w:tcPr/>
+          <w:p>
+            <w:pPr>
+              <w:pStyle w:val="Compact"/>
+            </w:pPr>
+            <w:r>
+              <w:t xml:space="preserve">[0.53, 0.88]</w:t>
+            </w:r>
+          </w:p>
+        </w:tc>
+        <w:tc>
+          <w:tcPr/>
+          <w:p>
+            <w:pPr>
+              <w:pStyle w:val="Compact"/>
+            </w:pPr>
+            <w:r>
+              <w:t xml:space="preserve">.004</w:t>
+            </w:r>
+          </w:p>
+        </w:tc>
+        <w:tc>
+          <w:tcPr/>
+          <w:p>
+            <w:pPr>
+              <w:pStyle w:val="Compact"/>
+            </w:pPr>
+            <w:r>
+              <w:t xml:space="preserve">0.600 (±0.019)</w:t>
+            </w:r>
+          </w:p>
+        </w:tc>
+        <w:tc>
+          <w:tcPr/>
+          <w:p>
+            <w:pPr>
+              <w:pStyle w:val="Compact"/>
+            </w:pPr>
+            <w:r>
+              <w:t xml:space="preserve">1,704</w:t>
+            </w:r>
+          </w:p>
+        </w:tc>
+      </w:tr>
+      <w:tr>
+        <w:tc>
+          <w:tcPr/>
+          <w:p>
+            <w:pPr>
+              <w:pStyle w:val="Compact"/>
+            </w:pPr>
+          </w:p>
+        </w:tc>
+        <w:tc>
+          <w:tcPr/>
+          <w:p>
+            <w:pPr>
+              <w:pStyle w:val="Compact"/>
+            </w:pPr>
+            <w:r>
+              <w:t xml:space="preserve">Tyrving (z)</w:t>
+            </w:r>
+          </w:p>
+        </w:tc>
+        <w:tc>
+          <w:tcPr/>
+          <w:p>
+            <w:pPr>
+              <w:pStyle w:val="Compact"/>
+            </w:pPr>
+            <w:r>
+              <w:t xml:space="preserve">1.41</w:t>
+            </w:r>
+          </w:p>
+        </w:tc>
+        <w:tc>
+          <w:tcPr/>
+          <w:p>
+            <w:pPr>
+              <w:pStyle w:val="Compact"/>
+            </w:pPr>
+            <w:r>
+              <w:t xml:space="preserve">[1.22, 1.64]</w:t>
+            </w:r>
+          </w:p>
+        </w:tc>
+        <w:tc>
+          <w:tcPr/>
+          <w:p>
+            <w:pPr>
+              <w:pStyle w:val="Compact"/>
+            </w:pPr>
+            <w:r>
+              <w:t xml:space="preserve">&lt; .001</w:t>
+            </w:r>
+          </w:p>
+        </w:tc>
+        <w:tc>
+          <w:tcPr/>
+          <w:p>
+            <w:pPr>
+              <w:pStyle w:val="Compact"/>
+            </w:pPr>
+          </w:p>
+        </w:tc>
+        <w:tc>
+          <w:tcPr/>
+          <w:p>
+            <w:pPr>
+              <w:pStyle w:val="Compact"/>
+            </w:pPr>
+          </w:p>
+        </w:tc>
+      </w:tr>
+      <w:tr>
+        <w:tc>
+          <w:tcPr/>
+          <w:p>
+            <w:pPr>
+              <w:pStyle w:val="Compact"/>
+            </w:pPr>
+          </w:p>
+        </w:tc>
+        <w:tc>
+          <w:tcPr/>
+          <w:p>
+            <w:pPr>
+              <w:pStyle w:val="Compact"/>
+            </w:pPr>
+            <w:r>
+              <w:t xml:space="preserve">HHI early (z)</w:t>
+            </w:r>
+          </w:p>
+        </w:tc>
+        <w:tc>
+          <w:tcPr/>
+          <w:p>
+            <w:pPr>
+              <w:pStyle w:val="Compact"/>
+            </w:pPr>
+            <w:r>
+              <w:t xml:space="preserve">1.09</w:t>
+            </w:r>
+          </w:p>
+        </w:tc>
+        <w:tc>
+          <w:tcPr/>
+          <w:p>
+            <w:pPr>
+              <w:pStyle w:val="Compact"/>
+            </w:pPr>
+            <w:r>
+              <w:t xml:space="preserve">[0.95, 1.24]</w:t>
+            </w:r>
+          </w:p>
+        </w:tc>
+        <w:tc>
+          <w:tcPr/>
+          <w:p>
+            <w:pPr>
+              <w:pStyle w:val="Compact"/>
+            </w:pPr>
+            <w:r>
+              <w:t xml:space="preserve">.238</w:t>
+            </w:r>
+          </w:p>
+        </w:tc>
+        <w:tc>
+          <w:tcPr/>
+          <w:p>
+            <w:pPr>
+              <w:pStyle w:val="Compact"/>
+            </w:pPr>
+          </w:p>
+        </w:tc>
+        <w:tc>
+          <w:tcPr/>
+          <w:p>
+            <w:pPr>
+              <w:pStyle w:val="Compact"/>
+            </w:pPr>
+          </w:p>
+        </w:tc>
+      </w:tr>
+      <w:tr>
+        <w:tc>
+          <w:tcPr/>
+          <w:p>
+            <w:pPr>
+              <w:pStyle w:val="Compact"/>
+            </w:pPr>
+            <w:r>
+              <w:t xml:space="preserve">L4: + Pre-milestone volume</w:t>
+            </w:r>
+          </w:p>
+        </w:tc>
+        <w:tc>
+          <w:tcPr/>
+          <w:p>
+            <w:pPr>
+              <w:pStyle w:val="Compact"/>
+            </w:pPr>
+            <w:r>
+              <w:t xml:space="preserve">Female</w:t>
+            </w:r>
+          </w:p>
+        </w:tc>
+        <w:tc>
+          <w:tcPr/>
+          <w:p>
+            <w:pPr>
+              <w:pStyle w:val="Compact"/>
+            </w:pPr>
+            <w:r>
+              <w:t xml:space="preserve">0.60</w:t>
+            </w:r>
+          </w:p>
+        </w:tc>
+        <w:tc>
+          <w:tcPr/>
+          <w:p>
+            <w:pPr>
+              <w:pStyle w:val="Compact"/>
+            </w:pPr>
+            <w:r>
+              <w:t xml:space="preserve">[0.46, 0.80]</w:t>
+            </w:r>
+          </w:p>
+        </w:tc>
+        <w:tc>
+          <w:tcPr/>
+          <w:p>
+            <w:pPr>
+              <w:pStyle w:val="Compact"/>
+            </w:pPr>
+            <w:r>
+              <w:t xml:space="preserve">&lt; .001</w:t>
+            </w:r>
+          </w:p>
+        </w:tc>
+        <w:tc>
+          <w:tcPr/>
+          <w:p>
+            <w:pPr>
+              <w:pStyle w:val="Compact"/>
+            </w:pPr>
+            <w:r>
+              <w:rPr>
+                <w:b/>
+                <w:bCs/>
+              </w:rPr>
+              <w:t xml:space="preserve">0.751</w:t>
+            </w:r>
+            <w:r>
+              <w:t xml:space="preserve"> </w:t>
+            </w:r>
+            <w:r>
+              <w:t xml:space="preserve">(±0.026)</w:t>
+            </w:r>
+          </w:p>
+        </w:tc>
+        <w:tc>
+          <w:tcPr/>
+          <w:p>
+            <w:pPr>
+              <w:pStyle w:val="Compact"/>
+            </w:pPr>
+            <w:r>
+              <w:t xml:space="preserve">1,704</w:t>
+            </w:r>
+          </w:p>
+        </w:tc>
+      </w:tr>
+      <w:tr>
+        <w:tc>
+          <w:tcPr/>
+          <w:p>
+            <w:pPr>
+              <w:pStyle w:val="Compact"/>
+            </w:pPr>
+          </w:p>
+        </w:tc>
+        <w:tc>
+          <w:tcPr/>
+          <w:p>
+            <w:pPr>
+              <w:pStyle w:val="Compact"/>
+            </w:pPr>
+            <w:r>
+              <w:t xml:space="preserve">Tyrving (z)</w:t>
+            </w:r>
+          </w:p>
+        </w:tc>
+        <w:tc>
+          <w:tcPr/>
+          <w:p>
+            <w:pPr>
+              <w:pStyle w:val="Compact"/>
+            </w:pPr>
+            <w:r>
+              <w:t xml:space="preserve">1.12</w:t>
+            </w:r>
+          </w:p>
+        </w:tc>
+        <w:tc>
+          <w:tcPr/>
+          <w:p>
+            <w:pPr>
+              <w:pStyle w:val="Compact"/>
+            </w:pPr>
+            <w:r>
+              <w:t xml:space="preserve">[0.96, 1.30]</w:t>
+            </w:r>
+          </w:p>
+        </w:tc>
+        <w:tc>
+          <w:tcPr/>
+          <w:p>
+            <w:pPr>
+              <w:pStyle w:val="Compact"/>
+            </w:pPr>
+            <w:r>
+              <w:t xml:space="preserve">.144</w:t>
+            </w:r>
+          </w:p>
+        </w:tc>
+        <w:tc>
+          <w:tcPr/>
+          <w:p>
+            <w:pPr>
+              <w:pStyle w:val="Compact"/>
+            </w:pPr>
+          </w:p>
+        </w:tc>
+        <w:tc>
+          <w:tcPr/>
+          <w:p>
+            <w:pPr>
+              <w:pStyle w:val="Compact"/>
+            </w:pPr>
+          </w:p>
+        </w:tc>
+      </w:tr>
+      <w:tr>
+        <w:tc>
+          <w:tcPr/>
+          <w:p>
+            <w:pPr>
+              <w:pStyle w:val="Compact"/>
+            </w:pPr>
+          </w:p>
+        </w:tc>
+        <w:tc>
+          <w:tcPr/>
+          <w:p>
+            <w:pPr>
+              <w:pStyle w:val="Compact"/>
+            </w:pPr>
+            <w:r>
+              <w:t xml:space="preserve">HHI early (z)</w:t>
+            </w:r>
+          </w:p>
+        </w:tc>
+        <w:tc>
+          <w:tcPr/>
+          <w:p>
+            <w:pPr>
+              <w:pStyle w:val="Compact"/>
+            </w:pPr>
+            <w:r>
+              <w:t xml:space="preserve">1.36</w:t>
+            </w:r>
+          </w:p>
+        </w:tc>
+        <w:tc>
+          <w:tcPr/>
+          <w:p>
+            <w:pPr>
+              <w:pStyle w:val="Compact"/>
+            </w:pPr>
+            <w:r>
+              <w:t xml:space="preserve">[1.17, 1.57]</w:t>
+            </w:r>
+          </w:p>
+        </w:tc>
+        <w:tc>
+          <w:tcPr/>
+          <w:p>
+            <w:pPr>
+              <w:pStyle w:val="Compact"/>
+            </w:pPr>
+            <w:r>
+              <w:t xml:space="preserve">&lt; .001</w:t>
+            </w:r>
+          </w:p>
+        </w:tc>
+        <w:tc>
+          <w:tcPr/>
+          <w:p>
+            <w:pPr>
+              <w:pStyle w:val="Compact"/>
+            </w:pPr>
+          </w:p>
+        </w:tc>
+        <w:tc>
+          <w:tcPr/>
+          <w:p>
+            <w:pPr>
+              <w:pStyle w:val="Compact"/>
+            </w:pPr>
+          </w:p>
+        </w:tc>
+      </w:tr>
+      <w:tr>
+        <w:tc>
+          <w:tcPr/>
+          <w:p>
+            <w:pPr>
+              <w:pStyle w:val="Compact"/>
+            </w:pPr>
+          </w:p>
+        </w:tc>
+        <w:tc>
+          <w:tcPr/>
+          <w:p>
+            <w:pPr>
+              <w:pStyle w:val="Compact"/>
+            </w:pPr>
+            <w:r>
+              <w:rPr>
+                <w:b/>
+                <w:bCs/>
+              </w:rPr>
+              <w:t xml:space="preserve">Pre-milestone volume (z)</w:t>
+            </w:r>
+          </w:p>
+        </w:tc>
+        <w:tc>
+          <w:tcPr/>
+          <w:p>
+            <w:pPr>
+              <w:pStyle w:val="Compact"/>
+            </w:pPr>
+            <w:r>
+              <w:rPr>
+                <w:b/>
+                <w:bCs/>
+              </w:rPr>
+              <w:t xml:space="preserve">2.40</w:t>
+            </w:r>
+          </w:p>
+        </w:tc>
+        <w:tc>
+          <w:tcPr/>
+          <w:p>
+            <w:pPr>
+              <w:pStyle w:val="Compact"/>
+            </w:pPr>
+            <w:r>
+              <w:rPr>
+                <w:b/>
+                <w:bCs/>
+              </w:rPr>
+              <w:t xml:space="preserve">[2.08, 2.76]</w:t>
+            </w:r>
+          </w:p>
+        </w:tc>
+        <w:tc>
+          <w:tcPr/>
+          <w:p>
+            <w:pPr>
+              <w:pStyle w:val="Compact"/>
+            </w:pPr>
+            <w:r>
+              <w:rPr>
+                <w:b/>
+                <w:bCs/>
+              </w:rPr>
+              <w:t xml:space="preserve">&lt; .001</w:t>
+            </w:r>
+          </w:p>
+        </w:tc>
+        <w:tc>
+          <w:tcPr/>
+          <w:p>
+            <w:pPr>
+              <w:pStyle w:val="Compact"/>
+            </w:pPr>
+          </w:p>
+        </w:tc>
+        <w:tc>
+          <w:tcPr/>
+          <w:p>
+            <w:pPr>
+              <w:pStyle w:val="Compact"/>
+            </w:pPr>
+          </w:p>
+        </w:tc>
+      </w:tr>
+    </w:tbl>
+    <w:p>
+      <w:pPr>
+        <w:pStyle w:val="BodyText"/>
+      </w:pPr>
+      <w:r>
+        <w:rPr>
+          <w:i/>
+          <w:iCs/>
+        </w:rPr>
+        <w:t xml:space="preserve">Note.</w:t>
+      </w:r>
+      <w:r>
+        <w:t xml:space="preserve"> </w:t>
+      </w:r>
+      <w:r>
+        <w:t xml:space="preserve">Logistic regression for binary active senior status (≥2 registered results in any year at age 20+). Predictors are observed during the baseline window (ages 13–14) only. Pre-milestone volume is the sum of distinct meets attended at ages 13 and 14. Continuous covariates are z-standardized so ORs reflect per-SD effects. Cross-validated AUC uses 5-fold stratified resampling. The pre-milestone volume coefficient is the dominant single-step gain (AUC 0.600 → 0.751). HHI becomes significant once volume is entered (mutual adjustment); the direction indicates that higher concentration in fewer event categories is associated with higher retention odds (see also Discussion 4.6).</w:t>
+      </w:r>
+    </w:p>
+    <w:p>
+      <w:r>
+        <w:pict>
+          <v:rect style="width:0;height:1.5pt" o:hralign="center" o:hrstd="t" o:hr="t"/>
+        </w:pict>
+      </w:r>
+    </w:p>
+    <w:bookmarkEnd w:id="68"/>
+    <w:bookmarkStart w:id="69" w:name="Xead665dc21eb92f77ea82cce847e701a62b1bef"/>
+    <w:p>
+      <w:pPr>
+        <w:pStyle w:val="Heading2"/>
+      </w:pPr>
+      <w:r>
+        <w:t xml:space="preserve">Table 4. Pull-back versus baseline heterogeneity: volume level and within-athlete change</w:t>
+      </w:r>
+    </w:p>
+    <w:p>
+      <w:pPr>
+        <w:pStyle w:val="FirstParagraph"/>
+      </w:pPr>
+      <w:r>
+        <w:t xml:space="preserve">Athletes still active (≥1 result) at age 14: 1,914; fitted models are complete-case on Tyrving, n = 1,549 (Tyrving missingness is concentrated among early-inactive athletes; see Supplementary Table S12).</w:t>
+      </w:r>
+    </w:p>
+    <w:tbl>
+      <w:tblPr>
+        <w:tblStyle w:val="Table"/>
+        <w:tblW w:type="pct" w:w="5000"/>
+        <w:tblLayout w:type="fixed"/>
+        <w:tblLook w:firstRow="1" w:lastRow="0" w:firstColumn="0" w:lastColumn="0" w:noHBand="0" w:noVBand="0" w:val="0020"/>
+      </w:tblPr>
+      <w:tblGrid>
+        <w:gridCol w:w="1584"/>
+        <w:gridCol w:w="1584"/>
+        <w:gridCol w:w="1584"/>
+        <w:gridCol w:w="1584"/>
+        <w:gridCol w:w="1584"/>
+      </w:tblGrid>
+      <w:tr>
+        <w:trPr>
+          <w:tblHeader w:val="on"/>
+        </w:trPr>
+        <w:tc>
+          <w:tcPr/>
+          <w:p>
+            <w:pPr>
+              <w:pStyle w:val="Compact"/>
+            </w:pPr>
+            <w:r>
+              <w:t xml:space="preserve">Model</w:t>
+            </w:r>
+          </w:p>
+        </w:tc>
+        <w:tc>
+          <w:tcPr/>
+          <w:p>
+            <w:pPr>
+              <w:pStyle w:val="Compact"/>
+            </w:pPr>
+            <w:r>
+              <w:t xml:space="preserve">Covariate</w:t>
+            </w:r>
+          </w:p>
+        </w:tc>
+        <w:tc>
+          <w:tcPr/>
+          <w:p>
+            <w:pPr>
+              <w:pStyle w:val="Compact"/>
+            </w:pPr>
+            <w:r>
+              <w:t xml:space="preserve">OR</w:t>
+            </w:r>
+          </w:p>
+        </w:tc>
+        <w:tc>
+          <w:tcPr/>
+          <w:p>
+            <w:pPr>
+              <w:pStyle w:val="Compact"/>
+            </w:pPr>
+            <w:r>
+              <w:t xml:space="preserve">95% CI</w:t>
+            </w:r>
+          </w:p>
+        </w:tc>
+        <w:tc>
+          <w:tcPr/>
+          <w:p>
+            <w:pPr>
+              <w:pStyle w:val="Compact"/>
+            </w:pPr>
+            <w:r>
+              <w:t xml:space="preserve">p</w:t>
+            </w:r>
+          </w:p>
+        </w:tc>
+      </w:tr>
+      <w:tr>
+        <w:tc>
+          <w:tcPr/>
+          <w:p>
+            <w:pPr>
+              <w:pStyle w:val="Compact"/>
+            </w:pPr>
+            <w:r>
+              <w:t xml:space="preserve">M1: Volume at age 14 only</w:t>
+            </w:r>
+          </w:p>
+        </w:tc>
+        <w:tc>
+          <w:tcPr/>
+          <w:p>
+            <w:pPr>
+              <w:pStyle w:val="Compact"/>
+            </w:pPr>
+            <w:r>
+              <w:t xml:space="preserve">Female</w:t>
+            </w:r>
+          </w:p>
+        </w:tc>
+        <w:tc>
+          <w:tcPr/>
+          <w:p>
+            <w:pPr>
+              <w:pStyle w:val="Compact"/>
+            </w:pPr>
+            <w:r>
+              <w:t xml:space="preserve">0.61</w:t>
+            </w:r>
+          </w:p>
+        </w:tc>
+        <w:tc>
+          <w:tcPr/>
+          <w:p>
+            <w:pPr>
+              <w:pStyle w:val="Compact"/>
+            </w:pPr>
+            <w:r>
+              <w:t xml:space="preserve">[0.46, 0.81]</w:t>
+            </w:r>
+          </w:p>
+        </w:tc>
+        <w:tc>
+          <w:tcPr/>
+          <w:p>
+            <w:pPr>
+              <w:pStyle w:val="Compact"/>
+            </w:pPr>
+            <w:r>
+              <w:t xml:space="preserve">&lt; .001</w:t>
+            </w:r>
+          </w:p>
+        </w:tc>
+      </w:tr>
+      <w:tr>
+        <w:tc>
+          <w:tcPr/>
+          <w:p>
+            <w:pPr>
+              <w:pStyle w:val="Compact"/>
+            </w:pPr>
+          </w:p>
+        </w:tc>
+        <w:tc>
+          <w:tcPr/>
+          <w:p>
+            <w:pPr>
+              <w:pStyle w:val="Compact"/>
+            </w:pPr>
+            <w:r>
+              <w:t xml:space="preserve">Tyrving (z)</w:t>
+            </w:r>
+          </w:p>
+        </w:tc>
+        <w:tc>
+          <w:tcPr/>
+          <w:p>
+            <w:pPr>
+              <w:pStyle w:val="Compact"/>
+            </w:pPr>
+            <w:r>
+              <w:t xml:space="preserve">1.12</w:t>
+            </w:r>
+          </w:p>
+        </w:tc>
+        <w:tc>
+          <w:tcPr/>
+          <w:p>
+            <w:pPr>
+              <w:pStyle w:val="Compact"/>
+            </w:pPr>
+            <w:r>
+              <w:t xml:space="preserve">[0.96, 1.30]</w:t>
+            </w:r>
+          </w:p>
+        </w:tc>
+        <w:tc>
+          <w:tcPr/>
+          <w:p>
+            <w:pPr>
+              <w:pStyle w:val="Compact"/>
+            </w:pPr>
+            <w:r>
+              <w:t xml:space="preserve">.167</w:t>
+            </w:r>
+          </w:p>
+        </w:tc>
+      </w:tr>
+      <w:tr>
+        <w:tc>
+          <w:tcPr/>
+          <w:p>
+            <w:pPr>
+              <w:pStyle w:val="Compact"/>
+            </w:pPr>
+          </w:p>
+        </w:tc>
+        <w:tc>
+          <w:tcPr/>
+          <w:p>
+            <w:pPr>
+              <w:pStyle w:val="Compact"/>
+            </w:pPr>
+            <w:r>
+              <w:rPr>
+                <w:b/>
+                <w:bCs/>
+              </w:rPr>
+              <w:t xml:space="preserve">Volume at age 14 (z)</w:t>
+            </w:r>
+          </w:p>
+        </w:tc>
+        <w:tc>
+          <w:tcPr/>
+          <w:p>
+            <w:pPr>
+              <w:pStyle w:val="Compact"/>
+            </w:pPr>
+            <w:r>
+              <w:rPr>
+                <w:b/>
+                <w:bCs/>
+              </w:rPr>
+              <w:t xml:space="preserve">2.23</w:t>
+            </w:r>
+          </w:p>
+        </w:tc>
+        <w:tc>
+          <w:tcPr/>
+          <w:p>
+            <w:pPr>
+              <w:pStyle w:val="Compact"/>
+            </w:pPr>
+            <w:r>
+              <w:rPr>
+                <w:b/>
+                <w:bCs/>
+              </w:rPr>
+              <w:t xml:space="preserve">[1.94, 2.57]</w:t>
+            </w:r>
+          </w:p>
+        </w:tc>
+        <w:tc>
+          <w:tcPr/>
+          <w:p>
+            <w:pPr>
+              <w:pStyle w:val="Compact"/>
+            </w:pPr>
+            <w:r>
+              <w:rPr>
+                <w:b/>
+                <w:bCs/>
+              </w:rPr>
+              <w:t xml:space="preserve">&lt; .001</w:t>
+            </w:r>
+          </w:p>
+        </w:tc>
+      </w:tr>
+      <w:tr>
+        <w:tc>
+          <w:tcPr/>
+          <w:p>
+            <w:pPr>
+              <w:pStyle w:val="Compact"/>
+            </w:pPr>
+            <w:r>
+              <w:t xml:space="preserve">M2: + Volume change 14→15</w:t>
+            </w:r>
+          </w:p>
+        </w:tc>
+        <w:tc>
+          <w:tcPr/>
+          <w:p>
+            <w:pPr>
+              <w:pStyle w:val="Compact"/>
+            </w:pPr>
+            <w:r>
+              <w:t xml:space="preserve">Female</w:t>
+            </w:r>
+          </w:p>
+        </w:tc>
+        <w:tc>
+          <w:tcPr/>
+          <w:p>
+            <w:pPr>
+              <w:pStyle w:val="Compact"/>
+            </w:pPr>
+            <w:r>
+              <w:t xml:space="preserve">0.60</w:t>
+            </w:r>
+          </w:p>
+        </w:tc>
+        <w:tc>
+          <w:tcPr/>
+          <w:p>
+            <w:pPr>
+              <w:pStyle w:val="Compact"/>
+            </w:pPr>
+            <w:r>
+              <w:t xml:space="preserve">[0.44, 0.81]</w:t>
+            </w:r>
+          </w:p>
+        </w:tc>
+        <w:tc>
+          <w:tcPr/>
+          <w:p>
+            <w:pPr>
+              <w:pStyle w:val="Compact"/>
+            </w:pPr>
+            <w:r>
+              <w:t xml:space="preserve">&lt; .001</w:t>
+            </w:r>
+          </w:p>
+        </w:tc>
+      </w:tr>
+      <w:tr>
+        <w:tc>
+          <w:tcPr/>
+          <w:p>
+            <w:pPr>
+              <w:pStyle w:val="Compact"/>
+            </w:pPr>
+          </w:p>
+        </w:tc>
+        <w:tc>
+          <w:tcPr/>
+          <w:p>
+            <w:pPr>
+              <w:pStyle w:val="Compact"/>
+            </w:pPr>
+            <w:r>
+              <w:t xml:space="preserve">Tyrving (z)</w:t>
+            </w:r>
+          </w:p>
+        </w:tc>
+        <w:tc>
+          <w:tcPr/>
+          <w:p>
+            <w:pPr>
+              <w:pStyle w:val="Compact"/>
+            </w:pPr>
+            <w:r>
+              <w:t xml:space="preserve">1.01</w:t>
+            </w:r>
+          </w:p>
+        </w:tc>
+        <w:tc>
+          <w:tcPr/>
+          <w:p>
+            <w:pPr>
+              <w:pStyle w:val="Compact"/>
+            </w:pPr>
+            <w:r>
+              <w:t xml:space="preserve">[0.86, 1.19]</w:t>
+            </w:r>
+          </w:p>
+        </w:tc>
+        <w:tc>
+          <w:tcPr/>
+          <w:p>
+            <w:pPr>
+              <w:pStyle w:val="Compact"/>
+            </w:pPr>
+            <w:r>
+              <w:t xml:space="preserve">.882</w:t>
+            </w:r>
+          </w:p>
+        </w:tc>
+      </w:tr>
+      <w:tr>
+        <w:tc>
+          <w:tcPr/>
+          <w:p>
+            <w:pPr>
+              <w:pStyle w:val="Compact"/>
+            </w:pPr>
+          </w:p>
+        </w:tc>
+        <w:tc>
+          <w:tcPr/>
+          <w:p>
+            <w:pPr>
+              <w:pStyle w:val="Compact"/>
+            </w:pPr>
+            <w:r>
+              <w:rPr>
+                <w:b/>
+                <w:bCs/>
+              </w:rPr>
+              <w:t xml:space="preserve">Volume at age 14 (z)</w:t>
+            </w:r>
+          </w:p>
+        </w:tc>
+        <w:tc>
+          <w:tcPr/>
+          <w:p>
+            <w:pPr>
+              <w:pStyle w:val="Compact"/>
+            </w:pPr>
+            <w:r>
+              <w:rPr>
+                <w:b/>
+                <w:bCs/>
+              </w:rPr>
+              <w:t xml:space="preserve">2.79</w:t>
+            </w:r>
+          </w:p>
+        </w:tc>
+        <w:tc>
+          <w:tcPr/>
+          <w:p>
+            <w:pPr>
+              <w:pStyle w:val="Compact"/>
+            </w:pPr>
+            <w:r>
+              <w:rPr>
+                <w:b/>
+                <w:bCs/>
+              </w:rPr>
+              <w:t xml:space="preserve">[2.37, 3.28]</w:t>
+            </w:r>
+          </w:p>
+        </w:tc>
+        <w:tc>
+          <w:tcPr/>
+          <w:p>
+            <w:pPr>
+              <w:pStyle w:val="Compact"/>
+            </w:pPr>
+            <w:r>
+              <w:rPr>
+                <w:b/>
+                <w:bCs/>
+              </w:rPr>
+              <w:t xml:space="preserve">&lt; .001</w:t>
+            </w:r>
+          </w:p>
+        </w:tc>
+      </w:tr>
+      <w:tr>
+        <w:tc>
+          <w:tcPr/>
+          <w:p>
+            <w:pPr>
+              <w:pStyle w:val="Compact"/>
+            </w:pPr>
+          </w:p>
+        </w:tc>
+        <w:tc>
+          <w:tcPr/>
+          <w:p>
+            <w:pPr>
+              <w:pStyle w:val="Compact"/>
+            </w:pPr>
+            <w:r>
+              <w:rPr>
+                <w:b/>
+                <w:bCs/>
+              </w:rPr>
+              <w:t xml:space="preserve">Volume change 14→15 (z)</w:t>
+            </w:r>
+          </w:p>
+        </w:tc>
+        <w:tc>
+          <w:tcPr/>
+          <w:p>
+            <w:pPr>
+              <w:pStyle w:val="Compact"/>
+            </w:pPr>
+            <w:r>
+              <w:rPr>
+                <w:b/>
+                <w:bCs/>
+              </w:rPr>
+              <w:t xml:space="preserve">2.44</w:t>
+            </w:r>
+          </w:p>
+        </w:tc>
+        <w:tc>
+          <w:tcPr/>
+          <w:p>
+            <w:pPr>
+              <w:pStyle w:val="Compact"/>
+            </w:pPr>
+            <w:r>
+              <w:rPr>
+                <w:b/>
+                <w:bCs/>
+              </w:rPr>
+              <w:t xml:space="preserve">[2.10, 2.83]</w:t>
+            </w:r>
+          </w:p>
+        </w:tc>
+        <w:tc>
+          <w:tcPr/>
+          <w:p>
+            <w:pPr>
+              <w:pStyle w:val="Compact"/>
+            </w:pPr>
+            <w:r>
+              <w:rPr>
+                <w:b/>
+                <w:bCs/>
+              </w:rPr>
+              <w:t xml:space="preserve">&lt; .001</w:t>
+            </w:r>
+          </w:p>
+        </w:tc>
+      </w:tr>
+    </w:tbl>
+    <w:p>
+      <w:pPr>
+        <w:pStyle w:val="BodyText"/>
+      </w:pPr>
+      <w:r>
+        <w:rPr>
+          <w:i/>
+          <w:iCs/>
+        </w:rPr>
+        <w:t xml:space="preserve">Note.</w:t>
+      </w:r>
+      <w:r>
+        <w:t xml:space="preserve"> </w:t>
+      </w:r>
+      <w:r>
+        <w:t xml:space="preserve">Pseudo-</w:t>
+      </w:r>
+      <w:r>
+        <w:rPr>
+          <w:i/>
+          <w:iCs/>
+        </w:rPr>
+        <w:t xml:space="preserve">R</w:t>
+      </w:r>
+      <w:r>
+        <w:t xml:space="preserve">² rose from 0.113 (M1) to 0.227 (M2): within-athlete change adds substantial information conditional on baseline level. A one-SD greater decline from age 14 to age 15 was associated with 2.4-times lower retention odds, conditional on level at age 14. Both baseline level and within-athlete pull-back contribute substantially and independently.</w:t>
+      </w:r>
+    </w:p>
+    <w:p>
+      <w:r>
+        <w:pict>
+          <v:rect style="width:0;height:1.5pt" o:hralign="center" o:hrstd="t" o:hr="t"/>
+        </w:pict>
+      </w:r>
+    </w:p>
+    <w:bookmarkEnd w:id="69"/>
+    <w:bookmarkStart w:id="70" w:name="X26906ff415d5e711796d5b4eb2458551a966eca"/>
+    <w:p>
+      <w:pPr>
+        <w:pStyle w:val="Heading2"/>
+      </w:pPr>
+      <w:r>
+        <w:t xml:space="preserve">Table 5. Time-varying hazard ratios (post-baseline Cox specification, period-specific)</w:t>
+      </w:r>
+    </w:p>
+    <w:tbl>
+      <w:tblPr>
+        <w:tblStyle w:val="Table"/>
+        <w:tblW w:type="pct" w:w="5000"/>
+        <w:tblLayout w:type="fixed"/>
+        <w:tblLook w:firstRow="1" w:lastRow="0" w:firstColumn="0" w:lastColumn="0" w:noHBand="0" w:noVBand="0" w:val="0020"/>
+      </w:tblPr>
+      <w:tblGrid>
+        <w:gridCol w:w="1980"/>
+        <w:gridCol w:w="1980"/>
+        <w:gridCol w:w="1980"/>
+        <w:gridCol w:w="1980"/>
+      </w:tblGrid>
+      <w:tr>
+        <w:trPr>
+          <w:tblHeader w:val="on"/>
+        </w:trPr>
+        <w:tc>
+          <w:tcPr/>
+          <w:p>
+            <w:pPr>
+              <w:pStyle w:val="Compact"/>
+            </w:pPr>
+            <w:r>
+              <w:t xml:space="preserve">Covariate</w:t>
+            </w:r>
+          </w:p>
+        </w:tc>
+        <w:tc>
+          <w:tcPr/>
+          <w:p>
+            <w:pPr>
+              <w:pStyle w:val="Compact"/>
+            </w:pPr>
+            <w:r>
+              <w:t xml:space="preserve">Years 0–3 since baseline (approx. ages 13–17)</w:t>
+            </w:r>
+          </w:p>
+        </w:tc>
+        <w:tc>
+          <w:tcPr/>
+          <w:p>
+            <w:pPr>
+              <w:pStyle w:val="Compact"/>
+            </w:pPr>
+            <w:r>
+              <w:t xml:space="preserve">Years 3–6 (approx. ages 16–20)</w:t>
+            </w:r>
+          </w:p>
+        </w:tc>
+        <w:tc>
+          <w:tcPr/>
+          <w:p>
+            <w:pPr>
+              <w:pStyle w:val="Compact"/>
+            </w:pPr>
+            <w:r>
+              <w:t xml:space="preserve">Years 6+ (approx. ages 19+)</w:t>
+            </w:r>
+          </w:p>
+        </w:tc>
+      </w:tr>
+      <w:tr>
+        <w:tc>
+          <w:tcPr/>
+          <w:p>
+            <w:pPr>
+              <w:pStyle w:val="Compact"/>
+            </w:pPr>
+            <w:r>
+              <w:t xml:space="preserve">Volume at age 15–16 (per SD)</w:t>
+            </w:r>
+          </w:p>
+        </w:tc>
+        <w:tc>
+          <w:tcPr/>
+          <w:p>
+            <w:pPr>
+              <w:pStyle w:val="Compact"/>
+            </w:pPr>
+            <w:r>
+              <w:t xml:space="preserve">0.14 [0.11, 0.16]</w:t>
+            </w:r>
+          </w:p>
+        </w:tc>
+        <w:tc>
+          <w:tcPr/>
+          <w:p>
+            <w:pPr>
+              <w:pStyle w:val="Compact"/>
+            </w:pPr>
+            <w:r>
+              <w:t xml:space="preserve">0.69 [0.60, 0.79]</w:t>
+            </w:r>
+          </w:p>
+        </w:tc>
+        <w:tc>
+          <w:tcPr/>
+          <w:p>
+            <w:pPr>
+              <w:pStyle w:val="Compact"/>
+            </w:pPr>
+            <w:r>
+              <w:t xml:space="preserve">0.96 [0.77, 1.19]</w:t>
+            </w:r>
+          </w:p>
+        </w:tc>
+      </w:tr>
+      <w:tr>
+        <w:tc>
+          <w:tcPr/>
+          <w:p>
+            <w:pPr>
+              <w:pStyle w:val="Compact"/>
+            </w:pPr>
+            <w:r>
+              <w:t xml:space="preserve">Championship types (count)</w:t>
+            </w:r>
+          </w:p>
+        </w:tc>
+        <w:tc>
+          <w:tcPr/>
+          <w:p>
+            <w:pPr>
+              <w:pStyle w:val="Compact"/>
+            </w:pPr>
+            <w:r>
+              <w:t xml:space="preserve">0.61 [0.55, 0.69]</w:t>
+            </w:r>
+          </w:p>
+        </w:tc>
+        <w:tc>
+          <w:tcPr/>
+          <w:p>
+            <w:pPr>
+              <w:pStyle w:val="Compact"/>
+            </w:pPr>
+            <w:r>
+              <w:t xml:space="preserve">0.88 [0.79, 0.99]</w:t>
+            </w:r>
+          </w:p>
+        </w:tc>
+        <w:tc>
+          <w:tcPr/>
+          <w:p>
+            <w:pPr>
+              <w:pStyle w:val="Compact"/>
+            </w:pPr>
+            <w:r>
+              <w:t xml:space="preserve">0.97 [0.78, 1.21]</w:t>
+            </w:r>
+          </w:p>
+        </w:tc>
+      </w:tr>
+      <w:tr>
+        <w:tc>
+          <w:tcPr/>
+          <w:p>
+            <w:pPr>
+              <w:pStyle w:val="Compact"/>
+            </w:pPr>
+            <w:r>
+              <w:t xml:space="preserve">Tyrving (z)</w:t>
+            </w:r>
+          </w:p>
+        </w:tc>
+        <w:tc>
+          <w:tcPr/>
+          <w:p>
+            <w:pPr>
+              <w:pStyle w:val="Compact"/>
+            </w:pPr>
+            <w:r>
+              <w:t xml:space="preserve">1.07 [0.99, 1.15]</w:t>
+            </w:r>
+          </w:p>
+        </w:tc>
+        <w:tc>
+          <w:tcPr/>
+          <w:p>
+            <w:pPr>
+              <w:pStyle w:val="Compact"/>
+            </w:pPr>
+            <w:r>
+              <w:t xml:space="preserve">0.92 [0.84, 1.01]</w:t>
+            </w:r>
+          </w:p>
+        </w:tc>
+        <w:tc>
+          <w:tcPr/>
+          <w:p>
+            <w:pPr>
+              <w:pStyle w:val="Compact"/>
+            </w:pPr>
+            <w:r>
+              <w:t xml:space="preserve">0.94 [0.78, 1.13]</w:t>
+            </w:r>
+          </w:p>
+        </w:tc>
+      </w:tr>
+      <w:tr>
+        <w:tc>
+          <w:tcPr/>
+          <w:p>
+            <w:pPr>
+              <w:pStyle w:val="Compact"/>
+            </w:pPr>
+            <w:r>
+              <w:t xml:space="preserve">HHI early (z)</w:t>
+            </w:r>
+          </w:p>
+        </w:tc>
+        <w:tc>
+          <w:tcPr/>
+          <w:p>
+            <w:pPr>
+              <w:pStyle w:val="Compact"/>
+            </w:pPr>
+            <w:r>
+              <w:t xml:space="preserve">0.97 [0.91, 1.05]</w:t>
+            </w:r>
+          </w:p>
+        </w:tc>
+        <w:tc>
+          <w:tcPr/>
+          <w:p>
+            <w:pPr>
+              <w:pStyle w:val="Compact"/>
+            </w:pPr>
+            <w:r>
+              <w:t xml:space="preserve">0.93 [0.85, 1.02]</w:t>
+            </w:r>
+          </w:p>
+        </w:tc>
+        <w:tc>
+          <w:tcPr/>
+          <w:p>
+            <w:pPr>
+              <w:pStyle w:val="Compact"/>
+            </w:pPr>
+            <w:r>
+              <w:t xml:space="preserve">1.02 [0.85, 1.21]</w:t>
+            </w:r>
+          </w:p>
+        </w:tc>
+      </w:tr>
+      <w:tr>
+        <w:tc>
+          <w:tcPr/>
+          <w:p>
+            <w:pPr>
+              <w:pStyle w:val="Compact"/>
+            </w:pPr>
+            <w:r>
+              <w:t xml:space="preserve">Female</w:t>
+            </w:r>
+          </w:p>
+        </w:tc>
+        <w:tc>
+          <w:tcPr/>
+          <w:p>
+            <w:pPr>
+              <w:pStyle w:val="Compact"/>
+            </w:pPr>
+            <w:r>
+              <w:t xml:space="preserve">1.16 [1.02, 1.31]</w:t>
+            </w:r>
+          </w:p>
+        </w:tc>
+        <w:tc>
+          <w:tcPr/>
+          <w:p>
+            <w:pPr>
+              <w:pStyle w:val="Compact"/>
+            </w:pPr>
+            <w:r>
+              <w:t xml:space="preserve">1.06 [0.91, 1.23]</w:t>
+            </w:r>
+          </w:p>
+        </w:tc>
+        <w:tc>
+          <w:tcPr/>
+          <w:p>
+            <w:pPr>
+              <w:pStyle w:val="Compact"/>
+            </w:pPr>
+            <w:r>
+              <w:t xml:space="preserve">1.09 [0.85, 1.39]</w:t>
+            </w:r>
+          </w:p>
+        </w:tc>
+      </w:tr>
+      <w:tr>
+        <w:tc>
+          <w:tcPr/>
+          <w:p>
+            <w:pPr>
+              <w:pStyle w:val="Compact"/>
+            </w:pPr>
+            <w:r>
+              <w:t xml:space="preserve">n at risk in interval</w:t>
+            </w:r>
+          </w:p>
+        </w:tc>
+        <w:tc>
+          <w:tcPr/>
+          <w:p>
+            <w:pPr>
+              <w:pStyle w:val="Compact"/>
+            </w:pPr>
+            <w:r>
+              <w:t xml:space="preserve">1,704</w:t>
+            </w:r>
+          </w:p>
+        </w:tc>
+        <w:tc>
+          <w:tcPr/>
+          <w:p>
+            <w:pPr>
+              <w:pStyle w:val="Compact"/>
+            </w:pPr>
+            <w:r>
+              <w:t xml:space="preserve">669</w:t>
+            </w:r>
+          </w:p>
+        </w:tc>
+        <w:tc>
+          <w:tcPr/>
+          <w:p>
+            <w:pPr>
+              <w:pStyle w:val="Compact"/>
+            </w:pPr>
+            <w:r>
+              <w:t xml:space="preserve">270</w:t>
+            </w:r>
+          </w:p>
+        </w:tc>
+      </w:tr>
+      <w:tr>
+        <w:tc>
+          <w:tcPr/>
+          <w:p>
+            <w:pPr>
+              <w:pStyle w:val="Compact"/>
+            </w:pPr>
+            <w:r>
+              <w:t xml:space="preserve">events in interval</w:t>
+            </w:r>
+          </w:p>
+        </w:tc>
+        <w:tc>
+          <w:tcPr/>
+          <w:p>
+            <w:pPr>
+              <w:pStyle w:val="Compact"/>
+            </w:pPr>
+            <w:r>
+              <w:t xml:space="preserve">1,035</w:t>
+            </w:r>
+          </w:p>
+        </w:tc>
+        <w:tc>
+          <w:tcPr/>
+          <w:p>
+            <w:pPr>
+              <w:pStyle w:val="Compact"/>
+            </w:pPr>
+            <w:r>
+              <w:t xml:space="preserve">399</w:t>
+            </w:r>
+          </w:p>
+        </w:tc>
+        <w:tc>
+          <w:tcPr/>
+          <w:p>
+            <w:pPr>
+              <w:pStyle w:val="Compact"/>
+            </w:pPr>
+            <w:r>
+              <w:t xml:space="preserve">136</w:t>
+            </w:r>
+          </w:p>
+        </w:tc>
+      </w:tr>
+      <w:tr>
+        <w:tc>
+          <w:tcPr/>
+          <w:p>
+            <w:pPr>
+              <w:pStyle w:val="Compact"/>
+            </w:pPr>
+            <w:r>
+              <w:t xml:space="preserve">C-index</w:t>
+            </w:r>
+          </w:p>
+        </w:tc>
+        <w:tc>
+          <w:tcPr/>
+          <w:p>
+            <w:pPr>
+              <w:pStyle w:val="Compact"/>
+            </w:pPr>
+            <w:r>
+              <w:t xml:space="preserve">0.894</w:t>
+            </w:r>
+          </w:p>
+        </w:tc>
+        <w:tc>
+          <w:tcPr/>
+          <w:p>
+            <w:pPr>
+              <w:pStyle w:val="Compact"/>
+            </w:pPr>
+            <w:r>
+              <w:t xml:space="preserve">0.661</w:t>
+            </w:r>
+          </w:p>
+        </w:tc>
+        <w:tc>
+          <w:tcPr/>
+          <w:p>
+            <w:pPr>
+              <w:pStyle w:val="Compact"/>
+            </w:pPr>
+            <w:r>
+              <w:t xml:space="preserve">0.582</w:t>
+            </w:r>
+          </w:p>
+        </w:tc>
+      </w:tr>
+    </w:tbl>
+    <w:p>
+      <w:pPr>
+        <w:pStyle w:val="BodyText"/>
+      </w:pPr>
+      <w:r>
+        <w:rPr>
+          <w:i/>
+          <w:iCs/>
+        </w:rPr>
+        <w:t xml:space="preserve">Note.</w:t>
+      </w:r>
+      <w:r>
+        <w:t xml:space="preserve"> </w:t>
+      </w:r>
+      <w:r>
+        <w:t xml:space="preserve">Period-specific Cox estimates from the post-baseline specification with covariates measured at ages 15–16 and ≤17. The early-window HR for ages-15–16 volume partly reflects operational overlap between predictor and outcome (low milestone volume is mechanical for athletes who drop out before age 15); this estimate should be read as descriptive of the time-varying association rather than as an independent prospective effect. Substantively, the protective association attenuates across follow-up, consistent with a proximal disengagement-marker interpretation.</w:t>
+      </w:r>
+    </w:p>
+    <w:p>
+      <w:r>
+        <w:pict>
+          <v:rect style="width:0;height:1.5pt" o:hralign="center" o:hrstd="t" o:hr="t"/>
+        </w:pict>
+      </w:r>
+    </w:p>
+    <w:bookmarkEnd w:id="70"/>
+    <w:bookmarkStart w:id="71" w:name="Xb1aa18e3395192ff7ac564cba097915b7cb4ac8"/>
+    <w:p>
+      <w:pPr>
+        <w:pStyle w:val="Heading2"/>
+      </w:pPr>
+      <w:r>
+        <w:t xml:space="preserve">Table 6. Prospective early-warning thresholds (pre-milestone volume, ages 13–14)</w:t>
+      </w:r>
+    </w:p>
+    <w:tbl>
+      <w:tblPr>
+        <w:tblStyle w:val="Table"/>
+        <w:tblW w:type="pct" w:w="5000"/>
+        <w:tblLayout w:type="fixed"/>
+        <w:tblLook w:firstRow="1" w:lastRow="0" w:firstColumn="0" w:lastColumn="0" w:noHBand="0" w:noVBand="0" w:val="0020"/>
+      </w:tblPr>
+      <w:tblGrid>
+        <w:gridCol w:w="990"/>
+        <w:gridCol w:w="990"/>
+        <w:gridCol w:w="990"/>
+        <w:gridCol w:w="990"/>
+        <w:gridCol w:w="990"/>
+        <w:gridCol w:w="990"/>
+        <w:gridCol w:w="990"/>
+        <w:gridCol w:w="990"/>
+      </w:tblGrid>
+      <w:tr>
+        <w:trPr>
+          <w:tblHeader w:val="on"/>
+        </w:trPr>
+        <w:tc>
+          <w:tcPr/>
+          <w:p>
+            <w:pPr>
+              <w:pStyle w:val="Compact"/>
+            </w:pPr>
+            <w:r>
+              <w:t xml:space="preserve">Threshold (flag if vol &lt;)</w:t>
+            </w:r>
+          </w:p>
+        </w:tc>
+        <w:tc>
+          <w:tcPr/>
+          <w:p>
+            <w:pPr>
+              <w:pStyle w:val="Compact"/>
+            </w:pPr>
+            <w:r>
+              <w:t xml:space="preserve">Flagged %</w:t>
+            </w:r>
+          </w:p>
+        </w:tc>
+        <w:tc>
+          <w:tcPr/>
+          <w:p>
+            <w:pPr>
+              <w:pStyle w:val="Compact"/>
+            </w:pPr>
+            <w:r>
+              <w:t xml:space="preserve">Sensitivity</w:t>
+            </w:r>
+          </w:p>
+        </w:tc>
+        <w:tc>
+          <w:tcPr/>
+          <w:p>
+            <w:pPr>
+              <w:pStyle w:val="Compact"/>
+            </w:pPr>
+            <w:r>
+              <w:t xml:space="preserve">Specificity</w:t>
+            </w:r>
+          </w:p>
+        </w:tc>
+        <w:tc>
+          <w:tcPr/>
+          <w:p>
+            <w:pPr>
+              <w:pStyle w:val="Compact"/>
+            </w:pPr>
+            <w:r>
+              <w:t xml:space="preserve">PPV</w:t>
+            </w:r>
+          </w:p>
+        </w:tc>
+        <w:tc>
+          <w:tcPr/>
+          <w:p>
+            <w:pPr>
+              <w:pStyle w:val="Compact"/>
+            </w:pPr>
+            <w:r>
+              <w:t xml:space="preserve">NPV</w:t>
+            </w:r>
+          </w:p>
+        </w:tc>
+        <w:tc>
+          <w:tcPr/>
+          <w:p>
+            <w:pPr>
+              <w:pStyle w:val="Compact"/>
+            </w:pPr>
+            <w:r>
+              <w:t xml:space="preserve">Senior retention, flagged</w:t>
+            </w:r>
+          </w:p>
+        </w:tc>
+        <w:tc>
+          <w:tcPr/>
+          <w:p>
+            <w:pPr>
+              <w:pStyle w:val="Compact"/>
+            </w:pPr>
+            <w:r>
+              <w:t xml:space="preserve">Senior retention, unflagged</w:t>
+            </w:r>
+          </w:p>
+        </w:tc>
+      </w:tr>
+      <w:tr>
+        <w:tc>
+          <w:tcPr/>
+          <w:p>
+            <w:pPr>
+              <w:pStyle w:val="Compact"/>
+            </w:pPr>
+            <w:r>
+              <w:t xml:space="preserve">5 meets</w:t>
+            </w:r>
+          </w:p>
+        </w:tc>
+        <w:tc>
+          <w:tcPr/>
+          <w:p>
+            <w:pPr>
+              <w:pStyle w:val="Compact"/>
+            </w:pPr>
+            <w:r>
+              <w:t xml:space="preserve">9.3</w:t>
+            </w:r>
+          </w:p>
+        </w:tc>
+        <w:tc>
+          <w:tcPr/>
+          <w:p>
+            <w:pPr>
+              <w:pStyle w:val="Compact"/>
+            </w:pPr>
+            <w:r>
+              <w:t xml:space="preserve">0.10 [0.09, 0.12]</w:t>
+            </w:r>
+          </w:p>
+        </w:tc>
+        <w:tc>
+          <w:tcPr/>
+          <w:p>
+            <w:pPr>
+              <w:pStyle w:val="Compact"/>
+            </w:pPr>
+            <w:r>
+              <w:t xml:space="preserve">0.96 [0.94, 0.98]</w:t>
+            </w:r>
+          </w:p>
+        </w:tc>
+        <w:tc>
+          <w:tcPr/>
+          <w:p>
+            <w:pPr>
+              <w:pStyle w:val="Compact"/>
+            </w:pPr>
+            <w:r>
+              <w:rPr>
+                <w:b/>
+                <w:bCs/>
+              </w:rPr>
+              <w:t xml:space="preserve">0.93</w:t>
+            </w:r>
+            <w:r>
+              <w:t xml:space="preserve"> </w:t>
+            </w:r>
+            <w:r>
+              <w:t xml:space="preserve">[0.89, 0.96]</w:t>
+            </w:r>
+          </w:p>
+        </w:tc>
+        <w:tc>
+          <w:tcPr/>
+          <w:p>
+            <w:pPr>
+              <w:pStyle w:val="Compact"/>
+            </w:pPr>
+            <w:r>
+              <w:t xml:space="preserve">0.17 [0.16, 0.19]</w:t>
+            </w:r>
+          </w:p>
+        </w:tc>
+        <w:tc>
+          <w:tcPr/>
+          <w:p>
+            <w:pPr>
+              <w:pStyle w:val="Compact"/>
+            </w:pPr>
+            <w:r>
+              <w:t xml:space="preserve">7.1% [3.6, 11.3]</w:t>
+            </w:r>
+          </w:p>
+        </w:tc>
+        <w:tc>
+          <w:tcPr/>
+          <w:p>
+            <w:pPr>
+              <w:pStyle w:val="Compact"/>
+            </w:pPr>
+            <w:r>
+              <w:t xml:space="preserve">17.3% [15.7, 19.1]</w:t>
+            </w:r>
+          </w:p>
+        </w:tc>
+      </w:tr>
+      <w:tr>
+        <w:tc>
+          <w:tcPr/>
+          <w:p>
+            <w:pPr>
+              <w:pStyle w:val="Compact"/>
+            </w:pPr>
+            <w:r>
+              <w:t xml:space="preserve">8 meets</w:t>
+            </w:r>
+          </w:p>
+        </w:tc>
+        <w:tc>
+          <w:tcPr/>
+          <w:p>
+            <w:pPr>
+              <w:pStyle w:val="Compact"/>
+            </w:pPr>
+            <w:r>
+              <w:t xml:space="preserve">19.8</w:t>
+            </w:r>
+          </w:p>
+        </w:tc>
+        <w:tc>
+          <w:tcPr/>
+          <w:p>
+            <w:pPr>
+              <w:pStyle w:val="Compact"/>
+            </w:pPr>
+            <w:r>
+              <w:t xml:space="preserve">0.22 [0.20, 0.24]</w:t>
+            </w:r>
+          </w:p>
+        </w:tc>
+        <w:tc>
+          <w:tcPr/>
+          <w:p>
+            <w:pPr>
+              <w:pStyle w:val="Compact"/>
+            </w:pPr>
+            <w:r>
+              <w:t xml:space="preserve">0.93 [0.90, 0.96]</w:t>
+            </w:r>
+          </w:p>
+        </w:tc>
+        <w:tc>
+          <w:tcPr/>
+          <w:p>
+            <w:pPr>
+              <w:pStyle w:val="Compact"/>
+            </w:pPr>
+            <w:r>
+              <w:rPr>
+                <w:b/>
+                <w:bCs/>
+              </w:rPr>
+              <w:t xml:space="preserve">0.94</w:t>
+            </w:r>
+            <w:r>
+              <w:t xml:space="preserve"> </w:t>
+            </w:r>
+            <w:r>
+              <w:t xml:space="preserve">[0.92, 0.96]</w:t>
+            </w:r>
+          </w:p>
+        </w:tc>
+        <w:tc>
+          <w:tcPr/>
+          <w:p>
+            <w:pPr>
+              <w:pStyle w:val="Compact"/>
+            </w:pPr>
+            <w:r>
+              <w:t xml:space="preserve">0.19 [0.17, 0.21]</w:t>
+            </w:r>
+          </w:p>
+        </w:tc>
+        <w:tc>
+          <w:tcPr/>
+          <w:p>
+            <w:pPr>
+              <w:pStyle w:val="Compact"/>
+            </w:pPr>
+            <w:r>
+              <w:t xml:space="preserve">5.7% [3.6, 7.9]</w:t>
+            </w:r>
+          </w:p>
+        </w:tc>
+        <w:tc>
+          <w:tcPr/>
+          <w:p>
+            <w:pPr>
+              <w:pStyle w:val="Compact"/>
+            </w:pPr>
+            <w:r>
+              <w:t xml:space="preserve">19.0% [17.2, 21.0]</w:t>
+            </w:r>
+          </w:p>
+        </w:tc>
+      </w:tr>
+      <w:tr>
+        <w:tc>
+          <w:tcPr/>
+          <w:p>
+            <w:pPr>
+              <w:pStyle w:val="Compact"/>
+            </w:pPr>
+            <w:r>
+              <w:t xml:space="preserve">10 meets</w:t>
+            </w:r>
+          </w:p>
+        </w:tc>
+        <w:tc>
+          <w:tcPr/>
+          <w:p>
+            <w:pPr>
+              <w:pStyle w:val="Compact"/>
+            </w:pPr>
+            <w:r>
+              <w:t xml:space="preserve">26.4</w:t>
+            </w:r>
+          </w:p>
+        </w:tc>
+        <w:tc>
+          <w:tcPr/>
+          <w:p>
+            <w:pPr>
+              <w:pStyle w:val="Compact"/>
+            </w:pPr>
+            <w:r>
+              <w:t xml:space="preserve">0.30 [0.28, 0.32]</w:t>
+            </w:r>
+          </w:p>
+        </w:tc>
+        <w:tc>
+          <w:tcPr/>
+          <w:p>
+            <w:pPr>
+              <w:pStyle w:val="Compact"/>
+            </w:pPr>
+            <w:r>
+              <w:t xml:space="preserve">0.91 [0.88, 0.94]</w:t>
+            </w:r>
+          </w:p>
+        </w:tc>
+        <w:tc>
+          <w:tcPr/>
+          <w:p>
+            <w:pPr>
+              <w:pStyle w:val="Compact"/>
+            </w:pPr>
+            <w:r>
+              <w:rPr>
+                <w:b/>
+                <w:bCs/>
+              </w:rPr>
+              <w:t xml:space="preserve">0.94</w:t>
+            </w:r>
+            <w:r>
+              <w:t xml:space="preserve"> </w:t>
+            </w:r>
+            <w:r>
+              <w:t xml:space="preserve">[0.92, 0.96]</w:t>
+            </w:r>
+          </w:p>
+        </w:tc>
+        <w:tc>
+          <w:tcPr/>
+          <w:p>
+            <w:pPr>
+              <w:pStyle w:val="Compact"/>
+            </w:pPr>
+            <w:r>
+              <w:t xml:space="preserve">0.20 [0.18, 0.22]</w:t>
+            </w:r>
+          </w:p>
+        </w:tc>
+        <w:tc>
+          <w:tcPr/>
+          <w:p>
+            <w:pPr>
+              <w:pStyle w:val="Compact"/>
+            </w:pPr>
+            <w:r>
+              <w:t xml:space="preserve">5.7% [3.9, 7.7]</w:t>
+            </w:r>
+          </w:p>
+        </w:tc>
+        <w:tc>
+          <w:tcPr/>
+          <w:p>
+            <w:pPr>
+              <w:pStyle w:val="Compact"/>
+            </w:pPr>
+            <w:r>
+              <w:t xml:space="preserve">20.2% [18.3, 22.2]</w:t>
+            </w:r>
+          </w:p>
+        </w:tc>
+      </w:tr>
+      <w:tr>
+        <w:tc>
+          <w:tcPr/>
+          <w:p>
+            <w:pPr>
+              <w:pStyle w:val="Compact"/>
+            </w:pPr>
+            <w:r>
+              <w:t xml:space="preserve">15 meets</w:t>
+            </w:r>
+          </w:p>
+        </w:tc>
+        <w:tc>
+          <w:tcPr/>
+          <w:p>
+            <w:pPr>
+              <w:pStyle w:val="Compact"/>
+            </w:pPr>
+            <w:r>
+              <w:t xml:space="preserve">43.1</w:t>
+            </w:r>
+          </w:p>
+        </w:tc>
+        <w:tc>
+          <w:tcPr/>
+          <w:p>
+            <w:pPr>
+              <w:pStyle w:val="Compact"/>
+            </w:pPr>
+            <w:r>
+              <w:t xml:space="preserve">0.48 [0.46, 0.50]</w:t>
+            </w:r>
+          </w:p>
+        </w:tc>
+        <w:tc>
+          <w:tcPr/>
+          <w:p>
+            <w:pPr>
+              <w:pStyle w:val="Compact"/>
+            </w:pPr>
+            <w:r>
+              <w:t xml:space="preserve">0.82 [0.77, 0.85]</w:t>
+            </w:r>
+          </w:p>
+        </w:tc>
+        <w:tc>
+          <w:tcPr/>
+          <w:p>
+            <w:pPr>
+              <w:pStyle w:val="Compact"/>
+            </w:pPr>
+            <w:r>
+              <w:rPr>
+                <w:b/>
+                <w:bCs/>
+              </w:rPr>
+              <w:t xml:space="preserve">0.93</w:t>
+            </w:r>
+            <w:r>
+              <w:t xml:space="preserve"> </w:t>
+            </w:r>
+            <w:r>
+              <w:t xml:space="preserve">[0.91, 0.95]</w:t>
+            </w:r>
+          </w:p>
+        </w:tc>
+        <w:tc>
+          <w:tcPr/>
+          <w:p>
+            <w:pPr>
+              <w:pStyle w:val="Compact"/>
+            </w:pPr>
+            <w:r>
+              <w:t xml:space="preserve">0.24 [0.21, 0.26]</w:t>
+            </w:r>
+          </w:p>
+        </w:tc>
+        <w:tc>
+          <w:tcPr/>
+          <w:p>
+            <w:pPr>
+              <w:pStyle w:val="Compact"/>
+            </w:pPr>
+            <w:r>
+              <w:t xml:space="preserve">7.0% [5.4, 8.7]</w:t>
+            </w:r>
+          </w:p>
+        </w:tc>
+        <w:tc>
+          <w:tcPr/>
+          <w:p>
+            <w:pPr>
+              <w:pStyle w:val="Compact"/>
+            </w:pPr>
+            <w:r>
+              <w:t xml:space="preserve">23.5% [21.1, 25.9]</w:t>
+            </w:r>
+          </w:p>
+        </w:tc>
+      </w:tr>
+    </w:tbl>
+    <w:p>
+      <w:pPr>
+        <w:pStyle w:val="BodyText"/>
+      </w:pPr>
+      <w:r>
+        <w:rPr>
+          <w:i/>
+          <w:iCs/>
+        </w:rPr>
+        <w:t xml:space="preserve">Note.</w:t>
+      </w:r>
+      <w:r>
+        <w:t xml:space="preserve"> </w:t>
+      </w:r>
+      <w:r>
+        <w:t xml:space="preserve">Classification performance of pre-milestone (ages 13–14) competition volume as a prospective early-warning indicator, applicable at the end of an athlete’s age-14 season, before the qualification window opens. All metrics are computed on one denominator (full cohort, n = 2,123); brackets are 2,000-replicate bootstrap 95% CIs. PPV is the proportion of flagged athletes who subsequently failed to retain senior activity. The final two columns give the absolute retention contrast: at the &lt; 10 threshold, 5.7% among flagged vs. 20.2% among unflagged athletes (a 3.5-fold difference). The high PPV partly reflects the population’s 84% non-retention base rate (the threshold improves precision by ~10 percentage points over base-rate prediction), and the NPV of ≈ 0.20 means unflagged athletes are not</w:t>
+      </w:r>
+      <w:r>
+        <w:t xml:space="preserve"> </w:t>
+      </w:r>
+      <w:r>
+        <w:t xml:space="preserve">“safe”</w:t>
+      </w:r>
+      <w:r>
+        <w:t xml:space="preserve">: roughly four in five of them also fail to retain. Calibration of the underlying model is reported in Supplementary Table S23.</w:t>
+      </w:r>
+    </w:p>
+    <w:p>
+      <w:r>
+        <w:pict>
+          <v:rect style="width:0;height:1.5pt" o:hralign="center" o:hrstd="t" o:hr="t"/>
+        </w:pict>
+      </w:r>
+    </w:p>
+    <w:bookmarkEnd w:id="71"/>
+    <w:bookmarkStart w:id="72" w:name="Xe9b21a988fbcae595b6ca55e69894fe6653a1ba"/>
+    <w:p>
+      <w:pPr>
+        <w:pStyle w:val="Heading2"/>
+      </w:pPr>
+      <w:r>
+        <w:t xml:space="preserve">Table 7. Cross-cohort replication of the primary L4 logistic model</w:t>
+      </w:r>
+    </w:p>
+    <w:tbl>
+      <w:tblPr>
+        <w:tblStyle w:val="Table"/>
+        <w:tblW w:type="pct" w:w="5000"/>
+        <w:tblLayout w:type="fixed"/>
+        <w:tblLook w:firstRow="1" w:lastRow="0" w:firstColumn="0" w:lastColumn="0" w:noHBand="0" w:noVBand="0" w:val="0020"/>
+      </w:tblPr>
+      <w:tblGrid>
+        <w:gridCol w:w="1320"/>
+        <w:gridCol w:w="1320"/>
+        <w:gridCol w:w="1320"/>
+        <w:gridCol w:w="1320"/>
+        <w:gridCol w:w="1320"/>
+        <w:gridCol w:w="1320"/>
+      </w:tblGrid>
+      <w:tr>
+        <w:trPr>
+          <w:tblHeader w:val="on"/>
+        </w:trPr>
+        <w:tc>
+          <w:tcPr/>
+          <w:p>
+            <w:pPr>
+              <w:pStyle w:val="Compact"/>
+            </w:pPr>
+            <w:r>
+              <w:t xml:space="preserve">Cohort</w:t>
+            </w:r>
+          </w:p>
+        </w:tc>
+        <w:tc>
+          <w:tcPr/>
+          <w:p>
+            <w:pPr>
+              <w:pStyle w:val="Compact"/>
+            </w:pPr>
+            <w:r>
+              <w:t xml:space="preserve">n</w:t>
+            </w:r>
+          </w:p>
+        </w:tc>
+        <w:tc>
+          <w:tcPr/>
+          <w:p>
+            <w:pPr>
+              <w:pStyle w:val="Compact"/>
+            </w:pPr>
+            <w:r>
+              <w:t xml:space="preserve">Covariate</w:t>
+            </w:r>
+          </w:p>
+        </w:tc>
+        <w:tc>
+          <w:tcPr/>
+          <w:p>
+            <w:pPr>
+              <w:pStyle w:val="Compact"/>
+            </w:pPr>
+            <w:r>
+              <w:t xml:space="preserve">OR</w:t>
+            </w:r>
+          </w:p>
+        </w:tc>
+        <w:tc>
+          <w:tcPr/>
+          <w:p>
+            <w:pPr>
+              <w:pStyle w:val="Compact"/>
+            </w:pPr>
+            <w:r>
+              <w:t xml:space="preserve">95% CI</w:t>
+            </w:r>
+          </w:p>
+        </w:tc>
+        <w:tc>
+          <w:tcPr/>
+          <w:p>
+            <w:pPr>
+              <w:pStyle w:val="Compact"/>
+            </w:pPr>
+            <w:r>
+              <w:t xml:space="preserve">p</w:t>
+            </w:r>
+          </w:p>
+        </w:tc>
+      </w:tr>
+      <w:tr>
+        <w:tc>
+          <w:tcPr/>
+          <w:p>
+            <w:pPr>
+              <w:pStyle w:val="Compact"/>
+            </w:pPr>
+            <w:r>
+              <w:t xml:space="preserve">1998–2000</w:t>
+            </w:r>
+          </w:p>
+        </w:tc>
+        <w:tc>
+          <w:tcPr/>
+          <w:p>
+            <w:pPr>
+              <w:pStyle w:val="Compact"/>
+            </w:pPr>
+            <w:r>
+              <w:t xml:space="preserve">1,065</w:t>
+            </w:r>
+          </w:p>
+        </w:tc>
+        <w:tc>
+          <w:tcPr/>
+          <w:p>
+            <w:pPr>
+              <w:pStyle w:val="Compact"/>
+            </w:pPr>
+            <w:r>
+              <w:t xml:space="preserve">Female</w:t>
+            </w:r>
+          </w:p>
+        </w:tc>
+        <w:tc>
+          <w:tcPr/>
+          <w:p>
+            <w:pPr>
+              <w:pStyle w:val="Compact"/>
+            </w:pPr>
+            <w:r>
+              <w:t xml:space="preserve">0.50</w:t>
+            </w:r>
+          </w:p>
+        </w:tc>
+        <w:tc>
+          <w:tcPr/>
+          <w:p>
+            <w:pPr>
+              <w:pStyle w:val="Compact"/>
+            </w:pPr>
+            <w:r>
+              <w:t xml:space="preserve">[0.34, 0.74]</w:t>
+            </w:r>
+          </w:p>
+        </w:tc>
+        <w:tc>
+          <w:tcPr/>
+          <w:p>
+            <w:pPr>
+              <w:pStyle w:val="Compact"/>
+            </w:pPr>
+            <w:r>
+              <w:t xml:space="preserve">&lt; .001</w:t>
+            </w:r>
+          </w:p>
+        </w:tc>
+      </w:tr>
+      <w:tr>
+        <w:tc>
+          <w:tcPr/>
+          <w:p>
+            <w:pPr>
+              <w:pStyle w:val="Compact"/>
+            </w:pPr>
+          </w:p>
+        </w:tc>
+        <w:tc>
+          <w:tcPr/>
+          <w:p>
+            <w:pPr>
+              <w:pStyle w:val="Compact"/>
+            </w:pPr>
+          </w:p>
+        </w:tc>
+        <w:tc>
+          <w:tcPr/>
+          <w:p>
+            <w:pPr>
+              <w:pStyle w:val="Compact"/>
+            </w:pPr>
+            <w:r>
+              <w:t xml:space="preserve">Tyrving (z)</w:t>
+            </w:r>
+          </w:p>
+        </w:tc>
+        <w:tc>
+          <w:tcPr/>
+          <w:p>
+            <w:pPr>
+              <w:pStyle w:val="Compact"/>
+            </w:pPr>
+            <w:r>
+              <w:t xml:space="preserve">1.14</w:t>
+            </w:r>
+          </w:p>
+        </w:tc>
+        <w:tc>
+          <w:tcPr/>
+          <w:p>
+            <w:pPr>
+              <w:pStyle w:val="Compact"/>
+            </w:pPr>
+            <w:r>
+              <w:t xml:space="preserve">[0.94, 1.39]</w:t>
+            </w:r>
+          </w:p>
+        </w:tc>
+        <w:tc>
+          <w:tcPr/>
+          <w:p>
+            <w:pPr>
+              <w:pStyle w:val="Compact"/>
+            </w:pPr>
+            <w:r>
+              <w:t xml:space="preserve">.179</w:t>
+            </w:r>
+          </w:p>
+        </w:tc>
+      </w:tr>
+      <w:tr>
+        <w:tc>
+          <w:tcPr/>
+          <w:p>
+            <w:pPr>
+              <w:pStyle w:val="Compact"/>
+            </w:pPr>
+          </w:p>
+        </w:tc>
+        <w:tc>
+          <w:tcPr/>
+          <w:p>
+            <w:pPr>
+              <w:pStyle w:val="Compact"/>
+            </w:pPr>
+          </w:p>
+        </w:tc>
+        <w:tc>
+          <w:tcPr/>
+          <w:p>
+            <w:pPr>
+              <w:pStyle w:val="Compact"/>
+            </w:pPr>
+            <w:r>
+              <w:t xml:space="preserve">HHI early (z)</w:t>
+            </w:r>
+          </w:p>
+        </w:tc>
+        <w:tc>
+          <w:tcPr/>
+          <w:p>
+            <w:pPr>
+              <w:pStyle w:val="Compact"/>
+            </w:pPr>
+            <w:r>
+              <w:t xml:space="preserve">1.24</w:t>
+            </w:r>
+          </w:p>
+        </w:tc>
+        <w:tc>
+          <w:tcPr/>
+          <w:p>
+            <w:pPr>
+              <w:pStyle w:val="Compact"/>
+            </w:pPr>
+            <w:r>
+              <w:t xml:space="preserve">[1.03, 1.51]</w:t>
+            </w:r>
+          </w:p>
+        </w:tc>
+        <w:tc>
+          <w:tcPr/>
+          <w:p>
+            <w:pPr>
+              <w:pStyle w:val="Compact"/>
+            </w:pPr>
+            <w:r>
+              <w:t xml:space="preserve">.027</w:t>
+            </w:r>
+          </w:p>
+        </w:tc>
+      </w:tr>
+      <w:tr>
+        <w:tc>
+          <w:tcPr/>
+          <w:p>
+            <w:pPr>
+              <w:pStyle w:val="Compact"/>
+            </w:pPr>
+          </w:p>
+        </w:tc>
+        <w:tc>
+          <w:tcPr/>
+          <w:p>
+            <w:pPr>
+              <w:pStyle w:val="Compact"/>
+            </w:pPr>
+          </w:p>
+        </w:tc>
+        <w:tc>
+          <w:tcPr/>
+          <w:p>
+            <w:pPr>
+              <w:pStyle w:val="Compact"/>
+            </w:pPr>
+            <w:r>
+              <w:rPr>
+                <w:b/>
+                <w:bCs/>
+              </w:rPr>
+              <w:t xml:space="preserve">Pre-milestone volume (z)</w:t>
+            </w:r>
+          </w:p>
+        </w:tc>
+        <w:tc>
+          <w:tcPr/>
+          <w:p>
+            <w:pPr>
+              <w:pStyle w:val="Compact"/>
+            </w:pPr>
+            <w:r>
+              <w:rPr>
+                <w:b/>
+                <w:bCs/>
+              </w:rPr>
+              <w:t xml:space="preserve">2.22</w:t>
+            </w:r>
+          </w:p>
+        </w:tc>
+        <w:tc>
+          <w:tcPr/>
+          <w:p>
+            <w:pPr>
+              <w:pStyle w:val="Compact"/>
+            </w:pPr>
+            <w:r>
+              <w:rPr>
+                <w:b/>
+                <w:bCs/>
+              </w:rPr>
+              <w:t xml:space="preserve">[1.86, 2.64]</w:t>
+            </w:r>
+          </w:p>
+        </w:tc>
+        <w:tc>
+          <w:tcPr/>
+          <w:p>
+            <w:pPr>
+              <w:pStyle w:val="Compact"/>
+            </w:pPr>
+            <w:r>
+              <w:rPr>
+                <w:b/>
+                <w:bCs/>
+              </w:rPr>
+              <w:t xml:space="preserve">&lt; .001</w:t>
+            </w:r>
+          </w:p>
+        </w:tc>
+      </w:tr>
+      <w:tr>
+        <w:tc>
+          <w:tcPr/>
+          <w:p>
+            <w:pPr>
+              <w:pStyle w:val="Compact"/>
+            </w:pPr>
+            <w:r>
+              <w:t xml:space="preserve">2001–2002</w:t>
+            </w:r>
+          </w:p>
+        </w:tc>
+        <w:tc>
+          <w:tcPr/>
+          <w:p>
+            <w:pPr>
+              <w:pStyle w:val="Compact"/>
+            </w:pPr>
+            <w:r>
+              <w:t xml:space="preserve">639</w:t>
+            </w:r>
+          </w:p>
+        </w:tc>
+        <w:tc>
+          <w:tcPr/>
+          <w:p>
+            <w:pPr>
+              <w:pStyle w:val="Compact"/>
+            </w:pPr>
+            <w:r>
+              <w:t xml:space="preserve">Female</w:t>
+            </w:r>
+          </w:p>
+        </w:tc>
+        <w:tc>
+          <w:tcPr/>
+          <w:p>
+            <w:pPr>
+              <w:pStyle w:val="Compact"/>
+            </w:pPr>
+            <w:r>
+              <w:t xml:space="preserve">0.82</w:t>
+            </w:r>
+          </w:p>
+        </w:tc>
+        <w:tc>
+          <w:tcPr/>
+          <w:p>
+            <w:pPr>
+              <w:pStyle w:val="Compact"/>
+            </w:pPr>
+            <w:r>
+              <w:t xml:space="preserve">[0.55, 1.22]</w:t>
+            </w:r>
+          </w:p>
+        </w:tc>
+        <w:tc>
+          <w:tcPr/>
+          <w:p>
+            <w:pPr>
+              <w:pStyle w:val="Compact"/>
+            </w:pPr>
+            <w:r>
+              <w:t xml:space="preserve">.333</w:t>
+            </w:r>
+          </w:p>
+        </w:tc>
+      </w:tr>
+      <w:tr>
+        <w:tc>
+          <w:tcPr/>
+          <w:p>
+            <w:pPr>
+              <w:pStyle w:val="Compact"/>
+            </w:pPr>
+          </w:p>
+        </w:tc>
+        <w:tc>
+          <w:tcPr/>
+          <w:p>
+            <w:pPr>
+              <w:pStyle w:val="Compact"/>
+            </w:pPr>
+          </w:p>
+        </w:tc>
+        <w:tc>
+          <w:tcPr/>
+          <w:p>
+            <w:pPr>
+              <w:pStyle w:val="Compact"/>
+            </w:pPr>
+            <w:r>
+              <w:t xml:space="preserve">Tyrving (z)</w:t>
+            </w:r>
+          </w:p>
+        </w:tc>
+        <w:tc>
+          <w:tcPr/>
+          <w:p>
+            <w:pPr>
+              <w:pStyle w:val="Compact"/>
+            </w:pPr>
+            <w:r>
+              <w:t xml:space="preserve">1.05</w:t>
+            </w:r>
+          </w:p>
+        </w:tc>
+        <w:tc>
+          <w:tcPr/>
+          <w:p>
+            <w:pPr>
+              <w:pStyle w:val="Compact"/>
+            </w:pPr>
+            <w:r>
+              <w:t xml:space="preserve">[0.84, 1.32]</w:t>
+            </w:r>
+          </w:p>
+        </w:tc>
+        <w:tc>
+          <w:tcPr/>
+          <w:p>
+            <w:pPr>
+              <w:pStyle w:val="Compact"/>
+            </w:pPr>
+            <w:r>
+              <w:t xml:space="preserve">.658</w:t>
+            </w:r>
+          </w:p>
+        </w:tc>
+      </w:tr>
+      <w:tr>
+        <w:tc>
+          <w:tcPr/>
+          <w:p>
+            <w:pPr>
+              <w:pStyle w:val="Compact"/>
+            </w:pPr>
+          </w:p>
+        </w:tc>
+        <w:tc>
+          <w:tcPr/>
+          <w:p>
+            <w:pPr>
+              <w:pStyle w:val="Compact"/>
+            </w:pPr>
+          </w:p>
+        </w:tc>
+        <w:tc>
+          <w:tcPr/>
+          <w:p>
+            <w:pPr>
+              <w:pStyle w:val="Compact"/>
+            </w:pPr>
+            <w:r>
+              <w:t xml:space="preserve">HHI early (z)</w:t>
+            </w:r>
+          </w:p>
+        </w:tc>
+        <w:tc>
+          <w:tcPr/>
+          <w:p>
+            <w:pPr>
+              <w:pStyle w:val="Compact"/>
+            </w:pPr>
+            <w:r>
+              <w:t xml:space="preserve">1.58</w:t>
+            </w:r>
+          </w:p>
+        </w:tc>
+        <w:tc>
+          <w:tcPr/>
+          <w:p>
+            <w:pPr>
+              <w:pStyle w:val="Compact"/>
+            </w:pPr>
+            <w:r>
+              <w:t xml:space="preserve">[1.25, 1.99]</w:t>
+            </w:r>
+          </w:p>
+        </w:tc>
+        <w:tc>
+          <w:tcPr/>
+          <w:p>
+            <w:pPr>
+              <w:pStyle w:val="Compact"/>
+            </w:pPr>
+            <w:r>
+              <w:t xml:space="preserve">&lt; .001</w:t>
+            </w:r>
+          </w:p>
+        </w:tc>
+      </w:tr>
+      <w:tr>
+        <w:tc>
+          <w:tcPr/>
+          <w:p>
+            <w:pPr>
+              <w:pStyle w:val="Compact"/>
+            </w:pPr>
+          </w:p>
+        </w:tc>
+        <w:tc>
+          <w:tcPr/>
+          <w:p>
+            <w:pPr>
+              <w:pStyle w:val="Compact"/>
+            </w:pPr>
+          </w:p>
+        </w:tc>
+        <w:tc>
+          <w:tcPr/>
+          <w:p>
+            <w:pPr>
+              <w:pStyle w:val="Compact"/>
+            </w:pPr>
+            <w:r>
+              <w:rPr>
+                <w:b/>
+                <w:bCs/>
+              </w:rPr>
+              <w:t xml:space="preserve">Pre-milestone volume (z)</w:t>
+            </w:r>
+          </w:p>
+        </w:tc>
+        <w:tc>
+          <w:tcPr/>
+          <w:p>
+            <w:pPr>
+              <w:pStyle w:val="Compact"/>
+            </w:pPr>
+            <w:r>
+              <w:rPr>
+                <w:b/>
+                <w:bCs/>
+              </w:rPr>
+              <w:t xml:space="preserve">2.79</w:t>
+            </w:r>
+          </w:p>
+        </w:tc>
+        <w:tc>
+          <w:tcPr/>
+          <w:p>
+            <w:pPr>
+              <w:pStyle w:val="Compact"/>
+            </w:pPr>
+            <w:r>
+              <w:rPr>
+                <w:b/>
+                <w:bCs/>
+              </w:rPr>
+              <w:t xml:space="preserve">[2.17, 3.58]</w:t>
+            </w:r>
+          </w:p>
+        </w:tc>
+        <w:tc>
+          <w:tcPr/>
+          <w:p>
+            <w:pPr>
+              <w:pStyle w:val="Compact"/>
+            </w:pPr>
+            <w:r>
+              <w:rPr>
+                <w:b/>
+                <w:bCs/>
+              </w:rPr>
+              <w:t xml:space="preserve">&lt; .001</w:t>
+            </w:r>
+          </w:p>
+        </w:tc>
+      </w:tr>
+    </w:tbl>
+    <w:p>
+      <w:pPr>
+        <w:pStyle w:val="BodyText"/>
+      </w:pPr>
+      <w:r>
+        <w:rPr>
+          <w:i/>
+          <w:iCs/>
+        </w:rPr>
+        <w:t xml:space="preserve">Note.</w:t>
+      </w:r>
+      <w:r>
+        <w:t xml:space="preserve"> </w:t>
+      </w:r>
+      <w:r>
+        <w:t xml:space="preserve">The primary baseline-only logistic model re-estimated separately within each birth-year cohort. Pre-milestone volume effect replicates in both cohorts at similar magnitude. The cohort difference in the female coefficient parallels the broader sex-effect pattern discussed in §4.5; HHI is significant in both cohorts in the same direction (higher concentration = higher retention).</w:t>
+      </w:r>
+    </w:p>
+    <w:p>
+      <w:r>
+        <w:pict>
+          <v:rect style="width:0;height:1.5pt" o:hralign="center" o:hrstd="t" o:hr="t"/>
+        </w:pict>
+      </w:r>
+    </w:p>
+    <w:bookmarkEnd w:id="72"/>
+    <w:bookmarkStart w:id="73" w:name="figure-captions"/>
     <w:p>
       <w:pPr>
         <w:pStyle w:val="Heading2"/>
@@ -4070,8 +8121,8 @@
         <w:t xml:space="preserve">Kaplan–Meier retention curves stratified by total competition volume across ages 15 and 16 (descriptive). Strata are: 0 meets, 1–5 meets, 6–15 meets, 16–30 meets, and 31+ meets. Athletes in the highest stratum retained 71% senior activity at follow-up year 14; athletes in the lowest stratum retained 4%. (Note: this descriptive stratification uses post-baseline measurement; primary effect estimates in Table 3 use only baseline-window predictors.)</w:t>
       </w:r>
     </w:p>
-    <w:bookmarkEnd w:id="65"/>
-    <w:bookmarkEnd w:id="66"/>
+    <w:bookmarkEnd w:id="73"/>
+    <w:bookmarkEnd w:id="74"/>
     <w:sectPr>
       <w:footnotePr>
         <w:numRestart w:val="eachSect"/>

</xml_diff>